<commit_message>
Delete heartData.py and update proposal docs
Remove heartData.py (deleted a BLE Mi Band 10 script that handled authentication and real-time heart-rate measurement; the file contained a placeholder MAC and AES key). Also update the project proposal documents (docs/Project Proposal Calorie Sense.docx and .pdf) with new binary versions.
</commit_message>
<xml_diff>
--- a/docs/Project Proposal Calorie Sense.docx
+++ b/docs/Project Proposal Calorie Sense.docx
@@ -229,8 +229,16 @@
               <w:rPr>
                 <w:b/>
               </w:rPr>
-              <w:t>Dr. Sampath Deegalla</w:t>
+              <w:t xml:space="preserve">Dr. Sampath </w:t>
             </w:r>
+            <w:proofErr w:type="spellStart"/>
+            <w:r>
+              <w:rPr>
+                <w:b/>
+              </w:rPr>
+              <w:t>Deegalla</w:t>
+            </w:r>
+            <w:proofErr w:type="spellEnd"/>
           </w:p>
         </w:tc>
       </w:tr>
@@ -1005,14 +1013,50 @@
           <w:sz w:val="22"/>
           <w:szCs w:val="22"/>
         </w:rPr>
-        <w:t>Random Forest, XGBoost, and Neural Networks</w:t>
-      </w:r>
-      <w:r>
-        <w:rPr>
-          <w:sz w:val="22"/>
-          <w:szCs w:val="22"/>
-        </w:rPr>
-        <w:t xml:space="preserve"> to build predictive models using publicly available fitness datasets. The final system will include a user-friendly web interface that allows users to input workout details and receive real-time calorie predictions and fitness insights.</w:t>
+        <w:t xml:space="preserve">Random Forest, </w:t>
+      </w:r>
+      <w:proofErr w:type="spellStart"/>
+      <w:r>
+        <w:rPr>
+          <w:b/>
+          <w:bCs/>
+          <w:sz w:val="22"/>
+          <w:szCs w:val="22"/>
+        </w:rPr>
+        <w:t>XGBoost</w:t>
+      </w:r>
+      <w:proofErr w:type="spellEnd"/>
+      <w:r>
+        <w:rPr>
+          <w:b/>
+          <w:bCs/>
+          <w:sz w:val="22"/>
+          <w:szCs w:val="22"/>
+        </w:rPr>
+        <w:t>, and Neural Networks</w:t>
+      </w:r>
+      <w:r>
+        <w:rPr>
+          <w:sz w:val="22"/>
+          <w:szCs w:val="22"/>
+        </w:rPr>
+        <w:t xml:space="preserve"> to build predictive models using publicly available fitness datasets. The final system will include a user-friendly web interface that allows users to input </w:t>
+      </w:r>
+      <w:proofErr w:type="spellStart"/>
+      <w:r>
+        <w:rPr>
+          <w:sz w:val="22"/>
+          <w:szCs w:val="22"/>
+        </w:rPr>
+        <w:t>workout</w:t>
+      </w:r>
+      <w:proofErr w:type="spellEnd"/>
+      <w:r>
+        <w:rPr>
+          <w:sz w:val="22"/>
+          <w:szCs w:val="22"/>
+        </w:rPr>
+        <w:t xml:space="preserve"> details and receive real-time calorie predictions and fitness insights.</w:t>
       </w:r>
     </w:p>
     <w:p>
@@ -1231,15 +1275,7 @@
           <w:sz w:val="22"/>
           <w:szCs w:val="22"/>
         </w:rPr>
-        <w:t xml:space="preserve"> Such a system can help users make better decisions about their exercise routines and improve overall health management</w:t>
-      </w:r>
-      <w:r>
-        <w:rPr>
-          <w:rFonts w:cstheme="minorHAnsi"/>
-          <w:sz w:val="22"/>
-          <w:szCs w:val="22"/>
-        </w:rPr>
-        <w:t>.</w:t>
+        <w:t xml:space="preserve"> Such a system can help users make better decisions about their exercise routines and improve overall health management.</w:t>
       </w:r>
     </w:p>
     <w:p>
@@ -1396,27 +1432,7 @@
           <w:sz w:val="22"/>
           <w:szCs w:val="22"/>
         </w:rPr>
-        <w:t>data</w:t>
-      </w:r>
-      <w:r>
-        <w:rPr>
-          <w:rFonts w:cstheme="minorHAnsi"/>
-          <w:b/>
-          <w:bCs/>
-          <w:sz w:val="22"/>
-          <w:szCs w:val="22"/>
-        </w:rPr>
-        <w:t xml:space="preserve"> </w:t>
-      </w:r>
-      <w:r>
-        <w:rPr>
-          <w:rFonts w:cstheme="minorHAnsi"/>
-          <w:b/>
-          <w:bCs/>
-          <w:sz w:val="22"/>
-          <w:szCs w:val="22"/>
-        </w:rPr>
-        <w:t>driven system that can accurately predict calories burned during workouts and provide personalized insights based on machine learning models.</w:t>
+        <w:t>data driven system that can accurately predict calories burned during workouts and provide personalized insights based on machine learning models.</w:t>
       </w:r>
     </w:p>
     <w:p>
@@ -1598,14 +1614,7 @@
           <w:sz w:val="22"/>
           <w:szCs w:val="22"/>
         </w:rPr>
-        <w:t>T</w:t>
-      </w:r>
-      <w:r>
-        <w:rPr>
-          <w:sz w:val="22"/>
-          <w:szCs w:val="22"/>
-        </w:rPr>
-        <w:t>he project will focus on the following components:</w:t>
+        <w:t>The project will focus on the following components:</w:t>
       </w:r>
     </w:p>
     <w:p>
@@ -1796,1882 +1805,1170 @@
       <w:pPr>
         <w:pStyle w:val="ListParagraph"/>
         <w:ind w:left="360"/>
-        <w:rPr>
-          <w:rFonts w:cstheme="minorHAnsi"/>
-          <w:sz w:val="22"/>
-          <w:szCs w:val="22"/>
-        </w:rPr>
-      </w:pPr>
-      <w:r>
-        <w:rPr>
-          <w:rFonts w:cstheme="minorHAnsi"/>
-          <w:sz w:val="22"/>
-          <w:szCs w:val="22"/>
-        </w:rPr>
-        <w:t>The project will utilize multiple datasets related to physical activity and calorie expenditure.</w:t>
-      </w:r>
-    </w:p>
-    <w:p>
-      <w:pPr>
-        <w:pStyle w:val="ListParagraph"/>
-        <w:ind w:left="360"/>
-        <w:rPr>
-          <w:rFonts w:cstheme="minorHAnsi"/>
-          <w:sz w:val="22"/>
-          <w:szCs w:val="22"/>
-        </w:rPr>
-      </w:pPr>
-      <w:r>
-        <w:rPr>
-          <w:rFonts w:cstheme="minorHAnsi"/>
-          <w:sz w:val="22"/>
-          <w:szCs w:val="22"/>
-        </w:rPr>
-        <w:t>For this project, multiple datasets and data sources will be combined to provide a robust foundation for calorie prediction and fitness analysis. The datasets include physiological data, activity data, fitness tracker data, and environmental information.</w:t>
-      </w:r>
-    </w:p>
-    <w:p>
-      <w:pPr>
-        <w:pStyle w:val="ListParagraph"/>
-        <w:numPr>
-          <w:ilvl w:val="0"/>
-          <w:numId w:val="41"/>
-        </w:numPr>
-        <w:rPr>
-          <w:rFonts w:cstheme="minorHAnsi"/>
+      </w:pPr>
+      <w:r>
+        <w:t>The project will utilize multiple datasets related to physical activity, calorie expenditure, fitness recommendations, and environmental conditions. For this project, multiple datasets and data sources have been carefully selected to provide a robust foundation for calorie prediction, context-aware analysis, and AI-driven fitness coaching. The datasets include physiological data, workout data, exercise recommendation data, and environmental information.</w:t>
+      </w:r>
+    </w:p>
+    <w:p>
+      <w:pPr>
+        <w:pStyle w:val="ListParagraph"/>
+        <w:numPr>
+          <w:ilvl w:val="0"/>
+          <w:numId w:val="42"/>
+        </w:numPr>
+        <w:rPr>
           <w:b/>
           <w:bCs/>
-          <w:sz w:val="22"/>
-          <w:szCs w:val="22"/>
-        </w:rPr>
-      </w:pPr>
-      <w:r>
-        <w:rPr>
-          <w:rFonts w:cstheme="minorHAnsi"/>
+        </w:rPr>
+      </w:pPr>
+      <w:r>
+        <w:rPr>
           <w:b/>
           <w:bCs/>
-          <w:sz w:val="22"/>
-          <w:szCs w:val="22"/>
-        </w:rPr>
-        <w:t>Calorie Burn Prediction Dataset (Primary Dataset)</w:t>
-      </w:r>
-    </w:p>
-    <w:p>
-      <w:pPr>
-        <w:pStyle w:val="ListParagraph"/>
-        <w:rPr>
-          <w:rFonts w:cstheme="minorHAnsi"/>
-          <w:sz w:val="22"/>
-          <w:szCs w:val="22"/>
-        </w:rPr>
-      </w:pPr>
-      <w:r>
-        <w:rPr>
-          <w:rFonts w:cstheme="minorHAnsi"/>
+        </w:rPr>
+        <w:t>Gym Members Exercise Dataset</w:t>
+      </w:r>
+      <w:r>
+        <w:rPr>
           <w:b/>
           <w:bCs/>
-          <w:sz w:val="22"/>
-          <w:szCs w:val="22"/>
-        </w:rPr>
-        <w:t>Source:</w:t>
-      </w:r>
-      <w:r>
-        <w:rPr>
-          <w:rFonts w:cstheme="minorHAnsi"/>
-          <w:sz w:val="22"/>
-          <w:szCs w:val="22"/>
-        </w:rPr>
-        <w:t xml:space="preserve"> Kaggle – </w:t>
-      </w:r>
-      <w:hyperlink r:id="rId7" w:tgtFrame="_new" w:history="1">
-        <w:r>
-          <w:rPr>
-            <w:rStyle w:val="Hyperlink"/>
-            <w:rFonts w:cstheme="minorHAnsi"/>
-            <w:sz w:val="22"/>
-            <w:szCs w:val="22"/>
-          </w:rPr>
-          <w:t>Calories Burnt Prediction Dataset</w:t>
-        </w:r>
-      </w:hyperlink>
-    </w:p>
-    <w:p>
-      <w:pPr>
-        <w:pStyle w:val="ListParagraph"/>
-        <w:rPr>
-          <w:rFonts w:cstheme="minorHAnsi"/>
-          <w:sz w:val="22"/>
-          <w:szCs w:val="22"/>
-        </w:rPr>
-      </w:pPr>
-      <w:r>
-        <w:rPr>
-          <w:rFonts w:cstheme="minorHAnsi"/>
+        </w:rPr>
+        <w:t xml:space="preserve"> (Primary)</w:t>
+      </w:r>
+    </w:p>
+    <w:p>
+      <w:pPr>
+        <w:pStyle w:val="ListParagraph"/>
+        <w:ind w:left="1440"/>
+      </w:pPr>
+      <w:r>
+        <w:rPr>
           <w:b/>
           <w:bCs/>
-          <w:sz w:val="22"/>
-          <w:szCs w:val="22"/>
-        </w:rPr>
-        <w:t>Features:</w:t>
-      </w:r>
-    </w:p>
-    <w:p>
-      <w:pPr>
-        <w:pStyle w:val="ListParagraph"/>
-        <w:numPr>
-          <w:ilvl w:val="0"/>
-          <w:numId w:val="37"/>
-        </w:numPr>
-        <w:tabs>
-          <w:tab w:val="clear" w:pos="720"/>
-          <w:tab w:val="num" w:pos="1080"/>
-        </w:tabs>
-        <w:ind w:left="1080"/>
-        <w:rPr>
-          <w:rFonts w:cstheme="minorHAnsi"/>
-          <w:sz w:val="22"/>
-          <w:szCs w:val="22"/>
-        </w:rPr>
-      </w:pPr>
-      <w:r>
-        <w:rPr>
-          <w:rFonts w:cstheme="minorHAnsi"/>
-          <w:sz w:val="22"/>
-          <w:szCs w:val="22"/>
-        </w:rPr>
-        <w:t>Age</w:t>
-      </w:r>
-    </w:p>
-    <w:p>
-      <w:pPr>
-        <w:pStyle w:val="ListParagraph"/>
-        <w:numPr>
-          <w:ilvl w:val="0"/>
-          <w:numId w:val="37"/>
-        </w:numPr>
-        <w:tabs>
-          <w:tab w:val="clear" w:pos="720"/>
-          <w:tab w:val="num" w:pos="1080"/>
-        </w:tabs>
-        <w:ind w:left="1080"/>
-        <w:rPr>
-          <w:rFonts w:cstheme="minorHAnsi"/>
-          <w:sz w:val="22"/>
-          <w:szCs w:val="22"/>
-        </w:rPr>
-      </w:pPr>
-      <w:r>
-        <w:rPr>
-          <w:rFonts w:cstheme="minorHAnsi"/>
-          <w:sz w:val="22"/>
-          <w:szCs w:val="22"/>
-        </w:rPr>
-        <w:t>Gender</w:t>
-      </w:r>
-    </w:p>
-    <w:p>
-      <w:pPr>
-        <w:pStyle w:val="ListParagraph"/>
-        <w:numPr>
-          <w:ilvl w:val="0"/>
-          <w:numId w:val="37"/>
-        </w:numPr>
-        <w:tabs>
-          <w:tab w:val="clear" w:pos="720"/>
-          <w:tab w:val="num" w:pos="1080"/>
-        </w:tabs>
-        <w:ind w:left="1080"/>
-        <w:rPr>
-          <w:rFonts w:cstheme="minorHAnsi"/>
-          <w:sz w:val="22"/>
-          <w:szCs w:val="22"/>
-        </w:rPr>
-      </w:pPr>
-      <w:r>
-        <w:rPr>
-          <w:rFonts w:cstheme="minorHAnsi"/>
-          <w:sz w:val="22"/>
-          <w:szCs w:val="22"/>
-        </w:rPr>
-        <w:t>Height</w:t>
-      </w:r>
-    </w:p>
-    <w:p>
-      <w:pPr>
-        <w:pStyle w:val="ListParagraph"/>
-        <w:numPr>
-          <w:ilvl w:val="0"/>
-          <w:numId w:val="37"/>
-        </w:numPr>
-        <w:tabs>
-          <w:tab w:val="clear" w:pos="720"/>
-          <w:tab w:val="num" w:pos="1080"/>
-        </w:tabs>
-        <w:ind w:left="1080"/>
-        <w:rPr>
-          <w:rFonts w:cstheme="minorHAnsi"/>
-          <w:sz w:val="22"/>
-          <w:szCs w:val="22"/>
-        </w:rPr>
-      </w:pPr>
-      <w:r>
-        <w:rPr>
-          <w:rFonts w:cstheme="minorHAnsi"/>
-          <w:sz w:val="22"/>
-          <w:szCs w:val="22"/>
-        </w:rPr>
-        <w:lastRenderedPageBreak/>
-        <w:t>Weight</w:t>
-      </w:r>
-    </w:p>
-    <w:p>
-      <w:pPr>
-        <w:pStyle w:val="ListParagraph"/>
-        <w:numPr>
-          <w:ilvl w:val="0"/>
-          <w:numId w:val="37"/>
-        </w:numPr>
-        <w:tabs>
-          <w:tab w:val="clear" w:pos="720"/>
-          <w:tab w:val="num" w:pos="1080"/>
-        </w:tabs>
-        <w:ind w:left="1080"/>
-        <w:rPr>
-          <w:rFonts w:cstheme="minorHAnsi"/>
-          <w:sz w:val="22"/>
-          <w:szCs w:val="22"/>
-        </w:rPr>
-      </w:pPr>
-      <w:r>
-        <w:rPr>
-          <w:rFonts w:cstheme="minorHAnsi"/>
-          <w:sz w:val="22"/>
-          <w:szCs w:val="22"/>
-        </w:rPr>
-        <w:t>Duration (minutes of exercise)</w:t>
-      </w:r>
-    </w:p>
-    <w:p>
-      <w:pPr>
-        <w:pStyle w:val="ListParagraph"/>
-        <w:numPr>
-          <w:ilvl w:val="0"/>
-          <w:numId w:val="37"/>
-        </w:numPr>
-        <w:tabs>
-          <w:tab w:val="clear" w:pos="720"/>
-          <w:tab w:val="num" w:pos="1080"/>
-        </w:tabs>
-        <w:ind w:left="1080"/>
-        <w:rPr>
-          <w:rFonts w:cstheme="minorHAnsi"/>
-          <w:sz w:val="22"/>
-          <w:szCs w:val="22"/>
-        </w:rPr>
-      </w:pPr>
-      <w:r>
-        <w:rPr>
-          <w:rFonts w:cstheme="minorHAnsi"/>
-          <w:sz w:val="22"/>
-          <w:szCs w:val="22"/>
-        </w:rPr>
-        <w:t>Heart Rate</w:t>
-      </w:r>
-    </w:p>
-    <w:p>
-      <w:pPr>
-        <w:pStyle w:val="ListParagraph"/>
-        <w:numPr>
-          <w:ilvl w:val="0"/>
-          <w:numId w:val="37"/>
-        </w:numPr>
-        <w:tabs>
-          <w:tab w:val="clear" w:pos="720"/>
-          <w:tab w:val="num" w:pos="1080"/>
-        </w:tabs>
-        <w:ind w:left="1080"/>
-        <w:rPr>
-          <w:rFonts w:cstheme="minorHAnsi"/>
-          <w:sz w:val="22"/>
-          <w:szCs w:val="22"/>
-        </w:rPr>
-      </w:pPr>
-      <w:r>
-        <w:rPr>
-          <w:rFonts w:cstheme="minorHAnsi"/>
-          <w:sz w:val="22"/>
-          <w:szCs w:val="22"/>
-        </w:rPr>
-        <w:t>Body Temperature</w:t>
-      </w:r>
-    </w:p>
-    <w:p>
-      <w:pPr>
-        <w:pStyle w:val="ListParagraph"/>
-        <w:numPr>
-          <w:ilvl w:val="0"/>
-          <w:numId w:val="37"/>
-        </w:numPr>
-        <w:tabs>
-          <w:tab w:val="clear" w:pos="720"/>
-          <w:tab w:val="num" w:pos="1080"/>
-        </w:tabs>
-        <w:ind w:left="1080"/>
-        <w:rPr>
-          <w:rFonts w:cstheme="minorHAnsi"/>
-          <w:sz w:val="22"/>
-          <w:szCs w:val="22"/>
-        </w:rPr>
-      </w:pPr>
-      <w:r>
-        <w:rPr>
-          <w:rFonts w:cstheme="minorHAnsi"/>
-          <w:sz w:val="22"/>
-          <w:szCs w:val="22"/>
-        </w:rPr>
-        <w:t>Calories (target variable)</w:t>
-      </w:r>
-    </w:p>
-    <w:p>
-      <w:pPr>
-        <w:pStyle w:val="ListParagraph"/>
-        <w:rPr>
-          <w:rFonts w:cstheme="minorHAnsi"/>
-          <w:sz w:val="22"/>
-          <w:szCs w:val="22"/>
-        </w:rPr>
-      </w:pPr>
-      <w:r>
-        <w:rPr>
-          <w:rFonts w:cstheme="minorHAnsi"/>
+        </w:rPr>
+        <w:t xml:space="preserve">Link: </w:t>
+      </w:r>
+      <w:r>
+        <w:rPr>
+          <w:i/>
+          <w:iCs/>
+        </w:rPr>
+        <w:t>kaggle.com/datasets/</w:t>
+      </w:r>
+      <w:proofErr w:type="spellStart"/>
+      <w:r>
+        <w:rPr>
+          <w:i/>
+          <w:iCs/>
+        </w:rPr>
+        <w:t>valakhorasani</w:t>
+      </w:r>
+      <w:proofErr w:type="spellEnd"/>
+      <w:r>
+        <w:rPr>
+          <w:i/>
+          <w:iCs/>
+        </w:rPr>
+        <w:t>/gym-members-exercise-dataset</w:t>
+      </w:r>
+    </w:p>
+    <w:p>
+      <w:pPr>
+        <w:pStyle w:val="ListParagraph"/>
+        <w:ind w:left="1440"/>
+      </w:pPr>
+      <w:r>
+        <w:rPr>
           <w:b/>
           <w:bCs/>
-          <w:sz w:val="22"/>
-          <w:szCs w:val="22"/>
-        </w:rPr>
-        <w:t>Purpose:</w:t>
-      </w:r>
-      <w:r>
-        <w:rPr>
-          <w:rFonts w:cstheme="minorHAnsi"/>
-          <w:sz w:val="22"/>
-          <w:szCs w:val="22"/>
-        </w:rPr>
-        <w:t xml:space="preserve"> This dataset will be used to train machine learning models for calorie prediction and provide the primary source of physiological and exercise data.</w:t>
-      </w:r>
-    </w:p>
-    <w:p>
-      <w:pPr>
-        <w:pStyle w:val="ListParagraph"/>
-        <w:numPr>
-          <w:ilvl w:val="0"/>
-          <w:numId w:val="41"/>
-        </w:numPr>
-        <w:rPr>
-          <w:rFonts w:cstheme="minorHAnsi"/>
+        </w:rPr>
+        <w:t>Features:</w:t>
+      </w:r>
+    </w:p>
+    <w:p>
+      <w:pPr>
+        <w:pStyle w:val="ListParagraph"/>
+        <w:numPr>
+          <w:ilvl w:val="0"/>
+          <w:numId w:val="43"/>
+        </w:numPr>
+      </w:pPr>
+      <w:r>
+        <w:lastRenderedPageBreak/>
+        <w:t>Age</w:t>
+      </w:r>
+    </w:p>
+    <w:p>
+      <w:pPr>
+        <w:pStyle w:val="ListParagraph"/>
+        <w:numPr>
+          <w:ilvl w:val="0"/>
+          <w:numId w:val="43"/>
+        </w:numPr>
+      </w:pPr>
+      <w:r>
+        <w:t>Gender</w:t>
+      </w:r>
+    </w:p>
+    <w:p>
+      <w:pPr>
+        <w:pStyle w:val="ListParagraph"/>
+        <w:numPr>
+          <w:ilvl w:val="0"/>
+          <w:numId w:val="43"/>
+        </w:numPr>
+      </w:pPr>
+      <w:r>
+        <w:t>Weight (kg)</w:t>
+      </w:r>
+    </w:p>
+    <w:p>
+      <w:pPr>
+        <w:pStyle w:val="ListParagraph"/>
+        <w:numPr>
+          <w:ilvl w:val="0"/>
+          <w:numId w:val="43"/>
+        </w:numPr>
+      </w:pPr>
+      <w:r>
+        <w:t>Height (m)</w:t>
+      </w:r>
+    </w:p>
+    <w:p>
+      <w:pPr>
+        <w:pStyle w:val="ListParagraph"/>
+        <w:numPr>
+          <w:ilvl w:val="0"/>
+          <w:numId w:val="43"/>
+        </w:numPr>
+      </w:pPr>
+      <w:r>
+        <w:t>BMI</w:t>
+      </w:r>
+    </w:p>
+    <w:p>
+      <w:pPr>
+        <w:pStyle w:val="ListParagraph"/>
+        <w:numPr>
+          <w:ilvl w:val="0"/>
+          <w:numId w:val="43"/>
+        </w:numPr>
+      </w:pPr>
+      <w:proofErr w:type="spellStart"/>
+      <w:r>
+        <w:t>Max_BPM</w:t>
+      </w:r>
+      <w:proofErr w:type="spellEnd"/>
+    </w:p>
+    <w:p>
+      <w:pPr>
+        <w:pStyle w:val="ListParagraph"/>
+        <w:numPr>
+          <w:ilvl w:val="0"/>
+          <w:numId w:val="43"/>
+        </w:numPr>
+      </w:pPr>
+      <w:proofErr w:type="spellStart"/>
+      <w:r>
+        <w:t>Avg_BPM</w:t>
+      </w:r>
+      <w:proofErr w:type="spellEnd"/>
+    </w:p>
+    <w:p>
+      <w:pPr>
+        <w:pStyle w:val="ListParagraph"/>
+        <w:numPr>
+          <w:ilvl w:val="0"/>
+          <w:numId w:val="43"/>
+        </w:numPr>
+      </w:pPr>
+      <w:proofErr w:type="spellStart"/>
+      <w:r>
+        <w:t>Resting_BPM</w:t>
+      </w:r>
+      <w:proofErr w:type="spellEnd"/>
+    </w:p>
+    <w:p>
+      <w:pPr>
+        <w:pStyle w:val="ListParagraph"/>
+        <w:numPr>
+          <w:ilvl w:val="0"/>
+          <w:numId w:val="43"/>
+        </w:numPr>
+      </w:pPr>
+      <w:proofErr w:type="spellStart"/>
+      <w:r>
+        <w:t>Session_Duration</w:t>
+      </w:r>
+      <w:proofErr w:type="spellEnd"/>
+      <w:r>
+        <w:t xml:space="preserve"> (hours)</w:t>
+      </w:r>
+    </w:p>
+    <w:p>
+      <w:pPr>
+        <w:pStyle w:val="ListParagraph"/>
+        <w:numPr>
+          <w:ilvl w:val="0"/>
+          <w:numId w:val="43"/>
+        </w:numPr>
+      </w:pPr>
+      <w:proofErr w:type="spellStart"/>
+      <w:r>
+        <w:t>Workout_Type</w:t>
+      </w:r>
+      <w:proofErr w:type="spellEnd"/>
+      <w:r>
+        <w:t xml:space="preserve"> (Cardio, Strength, HIIT, Yoga)</w:t>
+      </w:r>
+    </w:p>
+    <w:p>
+      <w:pPr>
+        <w:pStyle w:val="ListParagraph"/>
+        <w:numPr>
+          <w:ilvl w:val="0"/>
+          <w:numId w:val="43"/>
+        </w:numPr>
+      </w:pPr>
+      <w:proofErr w:type="spellStart"/>
+      <w:r>
+        <w:t>Workout_Frequency</w:t>
+      </w:r>
+      <w:proofErr w:type="spellEnd"/>
+      <w:r>
+        <w:t xml:space="preserve"> (days/week)</w:t>
+      </w:r>
+    </w:p>
+    <w:p>
+      <w:pPr>
+        <w:pStyle w:val="ListParagraph"/>
+        <w:numPr>
+          <w:ilvl w:val="0"/>
+          <w:numId w:val="43"/>
+        </w:numPr>
+      </w:pPr>
+      <w:proofErr w:type="spellStart"/>
+      <w:r>
+        <w:t>Experience_Level</w:t>
+      </w:r>
+      <w:proofErr w:type="spellEnd"/>
+    </w:p>
+    <w:p>
+      <w:pPr>
+        <w:pStyle w:val="ListParagraph"/>
+        <w:numPr>
+          <w:ilvl w:val="0"/>
+          <w:numId w:val="43"/>
+        </w:numPr>
+      </w:pPr>
+      <w:proofErr w:type="spellStart"/>
+      <w:r>
+        <w:t>Fat_Percentage</w:t>
+      </w:r>
+      <w:proofErr w:type="spellEnd"/>
+    </w:p>
+    <w:p>
+      <w:pPr>
+        <w:pStyle w:val="ListParagraph"/>
+        <w:numPr>
+          <w:ilvl w:val="0"/>
+          <w:numId w:val="43"/>
+        </w:numPr>
+      </w:pPr>
+      <w:proofErr w:type="spellStart"/>
+      <w:r>
+        <w:t>Water_Intake</w:t>
+      </w:r>
+      <w:proofErr w:type="spellEnd"/>
+      <w:r>
+        <w:t xml:space="preserve"> (liters)</w:t>
+      </w:r>
+    </w:p>
+    <w:p>
+      <w:pPr>
+        <w:pStyle w:val="ListParagraph"/>
+        <w:numPr>
+          <w:ilvl w:val="0"/>
+          <w:numId w:val="43"/>
+        </w:numPr>
+      </w:pPr>
+      <w:proofErr w:type="spellStart"/>
+      <w:r>
+        <w:t>Calories_Burned</w:t>
+      </w:r>
+      <w:proofErr w:type="spellEnd"/>
+      <w:r>
+        <w:t xml:space="preserve"> (target variable)</w:t>
+      </w:r>
+    </w:p>
+    <w:p>
+      <w:pPr>
+        <w:pStyle w:val="ListParagraph"/>
+        <w:ind w:left="1440"/>
+      </w:pPr>
+      <w:r>
+        <w:rPr>
           <w:b/>
           <w:bCs/>
-          <w:sz w:val="22"/>
-          <w:szCs w:val="22"/>
-        </w:rPr>
-      </w:pPr>
-      <w:r>
-        <w:rPr>
-          <w:rFonts w:cstheme="minorHAnsi"/>
+        </w:rPr>
+        <w:t>Purpose:</w:t>
+      </w:r>
+      <w:r>
+        <w:t xml:space="preserve"> This dataset serves as the primary training source for the machine learning calorie prediction models. It contains </w:t>
+      </w:r>
+      <w:r>
+        <w:t xml:space="preserve">real </w:t>
+      </w:r>
+      <w:r>
+        <w:t>world records covering a comprehensive set of physiological attributes, cardiovascular metrics, and workout characteristics.</w:t>
+      </w:r>
+    </w:p>
+    <w:p>
+      <w:pPr>
+        <w:pStyle w:val="ListParagraph"/>
+        <w:numPr>
+          <w:ilvl w:val="0"/>
+          <w:numId w:val="42"/>
+        </w:numPr>
+        <w:rPr>
           <w:b/>
           <w:bCs/>
-          <w:sz w:val="22"/>
-          <w:szCs w:val="22"/>
-        </w:rPr>
-        <w:t>Exercise &amp; Physical Activity Dataset</w:t>
-      </w:r>
-    </w:p>
-    <w:p>
-      <w:pPr>
-        <w:pStyle w:val="ListParagraph"/>
-        <w:rPr>
-          <w:rFonts w:cstheme="minorHAnsi"/>
-          <w:sz w:val="22"/>
-          <w:szCs w:val="22"/>
-        </w:rPr>
-      </w:pPr>
-      <w:r>
-        <w:rPr>
-          <w:rFonts w:cstheme="minorHAnsi"/>
+        </w:rPr>
+      </w:pPr>
+      <w:r>
+        <w:rPr>
           <w:b/>
           <w:bCs/>
-          <w:sz w:val="22"/>
-          <w:szCs w:val="22"/>
-        </w:rPr>
-        <w:t>Source:</w:t>
-      </w:r>
-      <w:r>
-        <w:rPr>
-          <w:rFonts w:cstheme="minorHAnsi"/>
-          <w:sz w:val="22"/>
-          <w:szCs w:val="22"/>
-        </w:rPr>
-        <w:t xml:space="preserve"> UCI Machine Learning Repository – </w:t>
-      </w:r>
-      <w:hyperlink r:id="rId8" w:tgtFrame="_new" w:history="1">
-        <w:r>
-          <w:rPr>
-            <w:rStyle w:val="Hyperlink"/>
-            <w:rFonts w:cstheme="minorHAnsi"/>
-            <w:sz w:val="22"/>
-            <w:szCs w:val="22"/>
-          </w:rPr>
-          <w:t>Human Activity Recognition Dataset</w:t>
-        </w:r>
-      </w:hyperlink>
-    </w:p>
-    <w:p>
-      <w:pPr>
-        <w:pStyle w:val="ListParagraph"/>
-        <w:rPr>
-          <w:rFonts w:cstheme="minorHAnsi"/>
-          <w:sz w:val="22"/>
-          <w:szCs w:val="22"/>
-        </w:rPr>
-      </w:pPr>
-      <w:r>
-        <w:rPr>
-          <w:rFonts w:cstheme="minorHAnsi"/>
+        </w:rPr>
+        <w:t>Exercise and Fitness Metrics Dataset (Environmental Context)</w:t>
+      </w:r>
+    </w:p>
+    <w:p>
+      <w:pPr>
+        <w:pStyle w:val="ListParagraph"/>
+        <w:ind w:left="1440"/>
+        <w:rPr>
+          <w:i/>
+          <w:iCs/>
+        </w:rPr>
+      </w:pPr>
+      <w:r>
+        <w:rPr>
           <w:b/>
           <w:bCs/>
-          <w:sz w:val="22"/>
-          <w:szCs w:val="22"/>
-        </w:rPr>
-        <w:t>Features:</w:t>
-      </w:r>
-    </w:p>
-    <w:p>
-      <w:pPr>
-        <w:pStyle w:val="ListParagraph"/>
-        <w:numPr>
-          <w:ilvl w:val="0"/>
-          <w:numId w:val="38"/>
-        </w:numPr>
-        <w:tabs>
-          <w:tab w:val="clear" w:pos="720"/>
-          <w:tab w:val="num" w:pos="1080"/>
-        </w:tabs>
-        <w:ind w:left="1080"/>
-        <w:rPr>
-          <w:rFonts w:cstheme="minorHAnsi"/>
-          <w:sz w:val="22"/>
-          <w:szCs w:val="22"/>
-        </w:rPr>
-      </w:pPr>
-      <w:r>
-        <w:rPr>
-          <w:rFonts w:cstheme="minorHAnsi"/>
-          <w:sz w:val="22"/>
-          <w:szCs w:val="22"/>
-        </w:rPr>
-        <w:t>Activity type (Walking, Running, Sitting, Cycling)</w:t>
-      </w:r>
-    </w:p>
-    <w:p>
-      <w:pPr>
-        <w:pStyle w:val="ListParagraph"/>
-        <w:numPr>
-          <w:ilvl w:val="0"/>
-          <w:numId w:val="38"/>
-        </w:numPr>
-        <w:tabs>
-          <w:tab w:val="clear" w:pos="720"/>
-          <w:tab w:val="num" w:pos="1080"/>
-        </w:tabs>
-        <w:ind w:left="1080"/>
-        <w:rPr>
-          <w:rFonts w:cstheme="minorHAnsi"/>
-          <w:sz w:val="22"/>
-          <w:szCs w:val="22"/>
-        </w:rPr>
-      </w:pPr>
-      <w:r>
-        <w:rPr>
-          <w:rFonts w:cstheme="minorHAnsi"/>
-          <w:sz w:val="22"/>
-          <w:szCs w:val="22"/>
-        </w:rPr>
-        <w:t>Body movement signals</w:t>
-      </w:r>
-    </w:p>
-    <w:p>
-      <w:pPr>
-        <w:pStyle w:val="ListParagraph"/>
-        <w:numPr>
-          <w:ilvl w:val="0"/>
-          <w:numId w:val="38"/>
-        </w:numPr>
-        <w:tabs>
-          <w:tab w:val="clear" w:pos="720"/>
-          <w:tab w:val="num" w:pos="1080"/>
-        </w:tabs>
-        <w:ind w:left="1080"/>
-        <w:rPr>
-          <w:rFonts w:cstheme="minorHAnsi"/>
-          <w:sz w:val="22"/>
-          <w:szCs w:val="22"/>
-        </w:rPr>
-      </w:pPr>
-      <w:r>
-        <w:rPr>
-          <w:rFonts w:cstheme="minorHAnsi"/>
-          <w:sz w:val="22"/>
-          <w:szCs w:val="22"/>
-        </w:rPr>
-        <w:t>Accelerometer data</w:t>
-      </w:r>
-    </w:p>
-    <w:p>
-      <w:pPr>
-        <w:pStyle w:val="ListParagraph"/>
-        <w:rPr>
-          <w:rFonts w:cstheme="minorHAnsi"/>
-          <w:sz w:val="22"/>
-          <w:szCs w:val="22"/>
-        </w:rPr>
-      </w:pPr>
-      <w:r>
-        <w:rPr>
-          <w:rFonts w:cstheme="minorHAnsi"/>
+        </w:rPr>
+        <w:t xml:space="preserve">Link: </w:t>
+      </w:r>
+      <w:r>
+        <w:rPr>
+          <w:i/>
+          <w:iCs/>
+        </w:rPr>
+        <w:t>kaggle.com/datasets/aakashjoshi123/exercise-and-fitness-metrics-dataset</w:t>
+      </w:r>
+    </w:p>
+    <w:p>
+      <w:pPr>
+        <w:pStyle w:val="ListParagraph"/>
+        <w:ind w:left="1440"/>
+        <w:rPr>
           <w:b/>
           <w:bCs/>
-          <w:sz w:val="22"/>
-          <w:szCs w:val="22"/>
-        </w:rPr>
-        <w:t>Purpose:</w:t>
-      </w:r>
-      <w:r>
-        <w:rPr>
-          <w:rFonts w:cstheme="minorHAnsi"/>
-          <w:sz w:val="22"/>
-          <w:szCs w:val="22"/>
-        </w:rPr>
-        <w:t xml:space="preserve"> This dataset will be used to classify the type of physical activity performed and help categorize workouts, which improves the context for calorie predictions.</w:t>
-      </w:r>
-    </w:p>
-    <w:p>
-      <w:pPr>
-        <w:pStyle w:val="ListParagraph"/>
-        <w:numPr>
-          <w:ilvl w:val="0"/>
-          <w:numId w:val="41"/>
-        </w:numPr>
-        <w:rPr>
-          <w:rFonts w:cstheme="minorHAnsi"/>
+        </w:rPr>
+      </w:pPr>
+      <w:r>
+        <w:rPr>
           <w:b/>
           <w:bCs/>
-          <w:sz w:val="22"/>
-          <w:szCs w:val="22"/>
-        </w:rPr>
-      </w:pPr>
-      <w:r>
-        <w:rPr>
-          <w:rFonts w:cstheme="minorHAnsi"/>
+        </w:rPr>
+        <w:t>Features:</w:t>
+      </w:r>
+    </w:p>
+    <w:p>
+      <w:pPr>
+        <w:pStyle w:val="ListParagraph"/>
+        <w:numPr>
+          <w:ilvl w:val="0"/>
+          <w:numId w:val="44"/>
+        </w:numPr>
+      </w:pPr>
+      <w:r>
+        <w:t>Age</w:t>
+      </w:r>
+    </w:p>
+    <w:p>
+      <w:pPr>
+        <w:pStyle w:val="ListParagraph"/>
+        <w:numPr>
+          <w:ilvl w:val="0"/>
+          <w:numId w:val="44"/>
+        </w:numPr>
+      </w:pPr>
+      <w:r>
+        <w:t>Gender</w:t>
+      </w:r>
+    </w:p>
+    <w:p>
+      <w:pPr>
+        <w:pStyle w:val="ListParagraph"/>
+        <w:numPr>
+          <w:ilvl w:val="0"/>
+          <w:numId w:val="44"/>
+        </w:numPr>
+      </w:pPr>
+      <w:r>
+        <w:t>BMI</w:t>
+      </w:r>
+    </w:p>
+    <w:p>
+      <w:pPr>
+        <w:pStyle w:val="ListParagraph"/>
+        <w:numPr>
+          <w:ilvl w:val="0"/>
+          <w:numId w:val="44"/>
+        </w:numPr>
+      </w:pPr>
+      <w:proofErr w:type="spellStart"/>
+      <w:r>
+        <w:t>Heart_Rate</w:t>
+      </w:r>
+      <w:proofErr w:type="spellEnd"/>
+    </w:p>
+    <w:p>
+      <w:pPr>
+        <w:pStyle w:val="ListParagraph"/>
+        <w:numPr>
+          <w:ilvl w:val="0"/>
+          <w:numId w:val="44"/>
+        </w:numPr>
+      </w:pPr>
+      <w:r>
+        <w:t>Duration</w:t>
+      </w:r>
+    </w:p>
+    <w:p>
+      <w:pPr>
+        <w:pStyle w:val="ListParagraph"/>
+        <w:numPr>
+          <w:ilvl w:val="0"/>
+          <w:numId w:val="44"/>
+        </w:numPr>
+      </w:pPr>
+      <w:proofErr w:type="spellStart"/>
+      <w:r>
+        <w:t>Calories_Burned</w:t>
+      </w:r>
+      <w:proofErr w:type="spellEnd"/>
+    </w:p>
+    <w:p>
+      <w:pPr>
+        <w:pStyle w:val="ListParagraph"/>
+        <w:numPr>
+          <w:ilvl w:val="0"/>
+          <w:numId w:val="44"/>
+        </w:numPr>
+      </w:pPr>
+      <w:proofErr w:type="spellStart"/>
+      <w:r>
+        <w:t>Weather_Condition</w:t>
+      </w:r>
+      <w:proofErr w:type="spellEnd"/>
+      <w:r>
+        <w:t xml:space="preserve"> (Sunny, Cloudy, Rainy)</w:t>
+      </w:r>
+    </w:p>
+    <w:p>
+      <w:pPr>
+        <w:pStyle w:val="ListParagraph"/>
+        <w:numPr>
+          <w:ilvl w:val="0"/>
+          <w:numId w:val="44"/>
+        </w:numPr>
+      </w:pPr>
+      <w:proofErr w:type="spellStart"/>
+      <w:r>
+        <w:t>Exercise_Intensity</w:t>
+      </w:r>
+      <w:proofErr w:type="spellEnd"/>
+      <w:r>
+        <w:t xml:space="preserve"> (scale of 1–10)</w:t>
+      </w:r>
+    </w:p>
+    <w:p>
+      <w:pPr>
+        <w:pStyle w:val="ListParagraph"/>
+        <w:ind w:left="1440"/>
+        <w:rPr>
           <w:b/>
           <w:bCs/>
-          <w:sz w:val="22"/>
-          <w:szCs w:val="22"/>
-        </w:rPr>
-        <w:t>Fitness Tracker Dataset</w:t>
-      </w:r>
-    </w:p>
-    <w:p>
-      <w:pPr>
-        <w:pStyle w:val="ListParagraph"/>
-        <w:rPr>
-          <w:rFonts w:cstheme="minorHAnsi"/>
-          <w:sz w:val="22"/>
-          <w:szCs w:val="22"/>
-        </w:rPr>
-      </w:pPr>
-      <w:r>
-        <w:rPr>
-          <w:rFonts w:cstheme="minorHAnsi"/>
+        </w:rPr>
+      </w:pPr>
+      <w:r>
+        <w:rPr>
           <w:b/>
           <w:bCs/>
-          <w:sz w:val="22"/>
-          <w:szCs w:val="22"/>
-        </w:rPr>
-        <w:t>Source:</w:t>
-      </w:r>
-      <w:r>
-        <w:rPr>
-          <w:rFonts w:cstheme="minorHAnsi"/>
-          <w:sz w:val="22"/>
-          <w:szCs w:val="22"/>
-        </w:rPr>
-        <w:t xml:space="preserve"> Kaggle – </w:t>
-      </w:r>
-      <w:hyperlink r:id="rId9" w:tgtFrame="_new" w:history="1">
-        <w:r>
-          <w:rPr>
-            <w:rStyle w:val="Hyperlink"/>
-            <w:rFonts w:cstheme="minorHAnsi"/>
-            <w:sz w:val="22"/>
-            <w:szCs w:val="22"/>
-          </w:rPr>
-          <w:t>Fitbit Fitness Tracker Data</w:t>
-        </w:r>
-      </w:hyperlink>
-    </w:p>
-    <w:p>
-      <w:pPr>
-        <w:pStyle w:val="ListParagraph"/>
-        <w:rPr>
-          <w:rFonts w:cstheme="minorHAnsi"/>
-          <w:sz w:val="22"/>
-          <w:szCs w:val="22"/>
-        </w:rPr>
-      </w:pPr>
-      <w:r>
-        <w:rPr>
-          <w:rFonts w:cstheme="minorHAnsi"/>
+        </w:rPr>
+        <w:t xml:space="preserve">Purpose: </w:t>
+      </w:r>
+      <w:r>
+        <w:t xml:space="preserve">This dataset introduces the environmental and contextual dimension to the prediction system. Unlike the primary dataset, it includes </w:t>
+      </w:r>
+      <w:proofErr w:type="spellStart"/>
+      <w:r>
+        <w:t>Weather_Condition</w:t>
+      </w:r>
+      <w:proofErr w:type="spellEnd"/>
+      <w:r>
+        <w:t xml:space="preserve"> and </w:t>
+      </w:r>
+      <w:proofErr w:type="spellStart"/>
+      <w:r>
+        <w:t>Exercise_Intensity</w:t>
+      </w:r>
+      <w:proofErr w:type="spellEnd"/>
+      <w:r>
+        <w:t xml:space="preserve"> as pre</w:t>
+      </w:r>
+      <w:r>
+        <w:t xml:space="preserve"> e</w:t>
+      </w:r>
+      <w:r>
+        <w:t>ncoded features across records with no missing values. It is used in combination with the primary dataset to train a context</w:t>
+      </w:r>
+      <w:r>
+        <w:t xml:space="preserve"> </w:t>
+      </w:r>
+      <w:r>
+        <w:t>aware calorie prediction</w:t>
+      </w:r>
+      <w:r>
+        <w:t>.</w:t>
+      </w:r>
+    </w:p>
+    <w:p>
+      <w:pPr>
+        <w:pStyle w:val="ListParagraph"/>
+        <w:numPr>
+          <w:ilvl w:val="0"/>
+          <w:numId w:val="42"/>
+        </w:numPr>
+        <w:rPr>
           <w:b/>
           <w:bCs/>
-          <w:sz w:val="22"/>
-          <w:szCs w:val="22"/>
-        </w:rPr>
-        <w:t>Features:</w:t>
-      </w:r>
-    </w:p>
-    <w:p>
-      <w:pPr>
-        <w:pStyle w:val="ListParagraph"/>
-        <w:numPr>
-          <w:ilvl w:val="0"/>
-          <w:numId w:val="39"/>
-        </w:numPr>
-        <w:tabs>
-          <w:tab w:val="clear" w:pos="720"/>
-          <w:tab w:val="num" w:pos="1080"/>
-        </w:tabs>
-        <w:ind w:left="1080"/>
-        <w:rPr>
-          <w:rFonts w:cstheme="minorHAnsi"/>
-          <w:sz w:val="22"/>
-          <w:szCs w:val="22"/>
-        </w:rPr>
-      </w:pPr>
-      <w:r>
-        <w:rPr>
-          <w:rFonts w:cstheme="minorHAnsi"/>
-          <w:sz w:val="22"/>
-          <w:szCs w:val="22"/>
-        </w:rPr>
-        <w:t>Daily Steps</w:t>
-      </w:r>
-    </w:p>
-    <w:p>
-      <w:pPr>
-        <w:pStyle w:val="ListParagraph"/>
-        <w:numPr>
-          <w:ilvl w:val="0"/>
-          <w:numId w:val="39"/>
-        </w:numPr>
-        <w:tabs>
-          <w:tab w:val="clear" w:pos="720"/>
-          <w:tab w:val="num" w:pos="1080"/>
-        </w:tabs>
-        <w:ind w:left="1080"/>
-        <w:rPr>
-          <w:rFonts w:cstheme="minorHAnsi"/>
-          <w:sz w:val="22"/>
-          <w:szCs w:val="22"/>
-        </w:rPr>
-      </w:pPr>
-      <w:r>
-        <w:rPr>
-          <w:rFonts w:cstheme="minorHAnsi"/>
-          <w:sz w:val="22"/>
-          <w:szCs w:val="22"/>
-        </w:rPr>
-        <w:t>Calories Burned</w:t>
-      </w:r>
-    </w:p>
-    <w:p>
-      <w:pPr>
-        <w:pStyle w:val="ListParagraph"/>
-        <w:numPr>
-          <w:ilvl w:val="0"/>
-          <w:numId w:val="39"/>
-        </w:numPr>
-        <w:tabs>
-          <w:tab w:val="clear" w:pos="720"/>
-          <w:tab w:val="num" w:pos="1080"/>
-        </w:tabs>
-        <w:ind w:left="1080"/>
-        <w:rPr>
-          <w:rFonts w:cstheme="minorHAnsi"/>
-          <w:sz w:val="22"/>
-          <w:szCs w:val="22"/>
-        </w:rPr>
-      </w:pPr>
-      <w:r>
-        <w:rPr>
-          <w:rFonts w:cstheme="minorHAnsi"/>
-          <w:sz w:val="22"/>
-          <w:szCs w:val="22"/>
-        </w:rPr>
-        <w:t>Distance</w:t>
-      </w:r>
-    </w:p>
-    <w:p>
-      <w:pPr>
-        <w:pStyle w:val="ListParagraph"/>
-        <w:numPr>
-          <w:ilvl w:val="0"/>
-          <w:numId w:val="39"/>
-        </w:numPr>
-        <w:tabs>
-          <w:tab w:val="clear" w:pos="720"/>
-          <w:tab w:val="num" w:pos="1080"/>
-        </w:tabs>
-        <w:ind w:left="1080"/>
-        <w:rPr>
-          <w:rFonts w:cstheme="minorHAnsi"/>
-          <w:sz w:val="22"/>
-          <w:szCs w:val="22"/>
-        </w:rPr>
-      </w:pPr>
-      <w:r>
-        <w:rPr>
-          <w:rFonts w:cstheme="minorHAnsi"/>
-          <w:sz w:val="22"/>
-          <w:szCs w:val="22"/>
-        </w:rPr>
-        <w:t>Active Minutes</w:t>
-      </w:r>
-    </w:p>
-    <w:p>
-      <w:pPr>
-        <w:pStyle w:val="ListParagraph"/>
-        <w:numPr>
-          <w:ilvl w:val="0"/>
-          <w:numId w:val="39"/>
-        </w:numPr>
-        <w:tabs>
-          <w:tab w:val="clear" w:pos="720"/>
-          <w:tab w:val="num" w:pos="1080"/>
-        </w:tabs>
-        <w:ind w:left="1080"/>
-        <w:rPr>
-          <w:rFonts w:cstheme="minorHAnsi"/>
-          <w:sz w:val="22"/>
-          <w:szCs w:val="22"/>
-        </w:rPr>
-      </w:pPr>
-      <w:r>
-        <w:rPr>
-          <w:rFonts w:cstheme="minorHAnsi"/>
-          <w:sz w:val="22"/>
-          <w:szCs w:val="22"/>
-        </w:rPr>
-        <w:t>Heart Rate</w:t>
-      </w:r>
-    </w:p>
-    <w:p>
-      <w:pPr>
-        <w:pStyle w:val="ListParagraph"/>
-        <w:rPr>
-          <w:rFonts w:cstheme="minorHAnsi"/>
-          <w:sz w:val="22"/>
-          <w:szCs w:val="22"/>
-        </w:rPr>
-      </w:pPr>
-      <w:r>
-        <w:rPr>
-          <w:rFonts w:cstheme="minorHAnsi"/>
+        </w:rPr>
+      </w:pPr>
+      <w:r>
+        <w:rPr>
           <w:b/>
           <w:bCs/>
-          <w:sz w:val="22"/>
-          <w:szCs w:val="22"/>
-        </w:rPr>
-        <w:t>Purpose:</w:t>
-      </w:r>
-      <w:r>
-        <w:rPr>
-          <w:rFonts w:cstheme="minorHAnsi"/>
-          <w:sz w:val="22"/>
-          <w:szCs w:val="22"/>
-        </w:rPr>
-        <w:t xml:space="preserve"> These additional features will enhance model performance and provide a broader context for personalizing predictions based on user activity patterns.</w:t>
-      </w:r>
-    </w:p>
-    <w:p>
-      <w:pPr>
-        <w:pStyle w:val="ListParagraph"/>
-        <w:numPr>
-          <w:ilvl w:val="0"/>
-          <w:numId w:val="41"/>
-        </w:numPr>
-        <w:rPr>
-          <w:rFonts w:cstheme="minorHAnsi"/>
+        </w:rPr>
+        <w:t>Exercise Fitness Exercises Dataset (Exercise Library)</w:t>
+      </w:r>
+    </w:p>
+    <w:p>
+      <w:pPr>
+        <w:pStyle w:val="ListParagraph"/>
+        <w:ind w:left="1440"/>
+        <w:rPr>
+          <w:i/>
+          <w:iCs/>
+        </w:rPr>
+      </w:pPr>
+      <w:r>
+        <w:rPr>
           <w:b/>
           <w:bCs/>
-          <w:sz w:val="22"/>
-          <w:szCs w:val="22"/>
-        </w:rPr>
-      </w:pPr>
-      <w:r>
-        <w:rPr>
-          <w:rFonts w:cstheme="minorHAnsi"/>
+        </w:rPr>
+        <w:t xml:space="preserve">Link: </w:t>
+      </w:r>
+      <w:r>
+        <w:rPr>
+          <w:i/>
+          <w:iCs/>
+        </w:rPr>
+        <w:t>kaggle.com/datasets/</w:t>
+      </w:r>
+      <w:proofErr w:type="spellStart"/>
+      <w:r>
+        <w:rPr>
+          <w:i/>
+          <w:iCs/>
+        </w:rPr>
+        <w:t>exercisedb</w:t>
+      </w:r>
+      <w:proofErr w:type="spellEnd"/>
+      <w:r>
+        <w:rPr>
+          <w:i/>
+          <w:iCs/>
+        </w:rPr>
+        <w:t>/fitness-exercises-dataset</w:t>
+      </w:r>
+    </w:p>
+    <w:p>
+      <w:pPr>
+        <w:pStyle w:val="ListParagraph"/>
+        <w:ind w:left="1440"/>
+      </w:pPr>
+      <w:r>
+        <w:rPr>
           <w:b/>
           <w:bCs/>
-          <w:sz w:val="22"/>
-          <w:szCs w:val="22"/>
-        </w:rPr>
-        <w:t>Weather Dataset</w:t>
-      </w:r>
-    </w:p>
-    <w:p>
-      <w:pPr>
-        <w:pStyle w:val="ListParagraph"/>
-        <w:rPr>
-          <w:rFonts w:cstheme="minorHAnsi"/>
-          <w:sz w:val="22"/>
-          <w:szCs w:val="22"/>
-        </w:rPr>
-      </w:pPr>
-      <w:r>
-        <w:rPr>
-          <w:rFonts w:cstheme="minorHAnsi"/>
+        </w:rPr>
+        <w:t>Features:</w:t>
+      </w:r>
+    </w:p>
+    <w:p>
+      <w:pPr>
+        <w:pStyle w:val="ListParagraph"/>
+        <w:numPr>
+          <w:ilvl w:val="0"/>
+          <w:numId w:val="45"/>
+        </w:numPr>
+      </w:pPr>
+      <w:r>
+        <w:lastRenderedPageBreak/>
+        <w:t>Exercise Name</w:t>
+      </w:r>
+    </w:p>
+    <w:p>
+      <w:pPr>
+        <w:pStyle w:val="ListParagraph"/>
+        <w:numPr>
+          <w:ilvl w:val="0"/>
+          <w:numId w:val="45"/>
+        </w:numPr>
+      </w:pPr>
+      <w:r>
+        <w:t>Target Muscle Group</w:t>
+      </w:r>
+    </w:p>
+    <w:p>
+      <w:pPr>
+        <w:pStyle w:val="ListParagraph"/>
+        <w:numPr>
+          <w:ilvl w:val="0"/>
+          <w:numId w:val="45"/>
+        </w:numPr>
+      </w:pPr>
+      <w:r>
+        <w:t>Body Part</w:t>
+      </w:r>
+    </w:p>
+    <w:p>
+      <w:pPr>
+        <w:pStyle w:val="ListParagraph"/>
+        <w:numPr>
+          <w:ilvl w:val="0"/>
+          <w:numId w:val="45"/>
+        </w:numPr>
+      </w:pPr>
+      <w:r>
+        <w:t>Equipment Required</w:t>
+      </w:r>
+    </w:p>
+    <w:p>
+      <w:pPr>
+        <w:pStyle w:val="ListParagraph"/>
+        <w:numPr>
+          <w:ilvl w:val="0"/>
+          <w:numId w:val="45"/>
+        </w:numPr>
+      </w:pPr>
+      <w:r>
+        <w:t>Exercise Type (Strength, Cardio, etc.)</w:t>
+      </w:r>
+    </w:p>
+    <w:p>
+      <w:pPr>
+        <w:pStyle w:val="ListParagraph"/>
+        <w:numPr>
+          <w:ilvl w:val="0"/>
+          <w:numId w:val="45"/>
+        </w:numPr>
+      </w:pPr>
+      <w:r>
+        <w:t>Secondary Muscles</w:t>
+      </w:r>
+    </w:p>
+    <w:p>
+      <w:pPr>
+        <w:pStyle w:val="ListParagraph"/>
+        <w:numPr>
+          <w:ilvl w:val="0"/>
+          <w:numId w:val="45"/>
+        </w:numPr>
+      </w:pPr>
+      <w:r>
+        <w:t>Step-by-step Instructions</w:t>
+      </w:r>
+    </w:p>
+    <w:p>
+      <w:pPr>
+        <w:pStyle w:val="ListParagraph"/>
+        <w:ind w:left="1440"/>
+      </w:pPr>
+      <w:r>
+        <w:rPr>
           <w:b/>
           <w:bCs/>
-          <w:sz w:val="22"/>
-          <w:szCs w:val="22"/>
-        </w:rPr>
-        <w:t>Source:</w:t>
-      </w:r>
-      <w:r>
-        <w:rPr>
-          <w:rFonts w:cstheme="minorHAnsi"/>
-          <w:sz w:val="22"/>
-          <w:szCs w:val="22"/>
-        </w:rPr>
-        <w:t xml:space="preserve"> OpenWeather API – </w:t>
-      </w:r>
-      <w:hyperlink r:id="rId10" w:tgtFrame="_new" w:history="1">
-        <w:r>
-          <w:rPr>
-            <w:rStyle w:val="Hyperlink"/>
-            <w:rFonts w:cstheme="minorHAnsi"/>
-            <w:sz w:val="22"/>
-            <w:szCs w:val="22"/>
-          </w:rPr>
-          <w:t>https://openweathermap.org/api</w:t>
-        </w:r>
-      </w:hyperlink>
-    </w:p>
-    <w:p>
-      <w:pPr>
-        <w:pStyle w:val="ListParagraph"/>
-        <w:rPr>
-          <w:rFonts w:cstheme="minorHAnsi"/>
-          <w:sz w:val="22"/>
-          <w:szCs w:val="22"/>
-        </w:rPr>
-      </w:pPr>
-      <w:r>
-        <w:rPr>
-          <w:rFonts w:cstheme="minorHAnsi"/>
+        </w:rPr>
+        <w:t>Purpose:</w:t>
+      </w:r>
+      <w:r>
+        <w:t xml:space="preserve"> This dataset functions as the exercise reference library for the AI Coaching Module. It is not used for model training but is queried at runtime to retrieve specific exercise recommendations based on the user's fitness profile, target muscle groups, and available equipment.</w:t>
+      </w:r>
+    </w:p>
+    <w:p>
+      <w:pPr>
+        <w:pStyle w:val="ListParagraph"/>
+        <w:numPr>
+          <w:ilvl w:val="0"/>
+          <w:numId w:val="42"/>
+        </w:numPr>
+        <w:rPr>
           <w:b/>
           <w:bCs/>
-          <w:sz w:val="22"/>
-          <w:szCs w:val="22"/>
-        </w:rPr>
-        <w:t>Features:</w:t>
-      </w:r>
-    </w:p>
-    <w:p>
-      <w:pPr>
-        <w:pStyle w:val="ListParagraph"/>
-        <w:numPr>
-          <w:ilvl w:val="0"/>
-          <w:numId w:val="40"/>
-        </w:numPr>
-        <w:tabs>
-          <w:tab w:val="clear" w:pos="720"/>
-          <w:tab w:val="num" w:pos="1080"/>
-        </w:tabs>
-        <w:ind w:left="1080"/>
-        <w:rPr>
-          <w:rFonts w:cstheme="minorHAnsi"/>
-          <w:sz w:val="22"/>
-          <w:szCs w:val="22"/>
-        </w:rPr>
-      </w:pPr>
-      <w:r>
-        <w:rPr>
-          <w:rFonts w:cstheme="minorHAnsi"/>
-          <w:sz w:val="22"/>
-          <w:szCs w:val="22"/>
-        </w:rPr>
-        <w:t>Temperature</w:t>
-      </w:r>
-    </w:p>
-    <w:p>
-      <w:pPr>
-        <w:pStyle w:val="ListParagraph"/>
-        <w:numPr>
-          <w:ilvl w:val="0"/>
-          <w:numId w:val="40"/>
-        </w:numPr>
-        <w:tabs>
-          <w:tab w:val="clear" w:pos="720"/>
-          <w:tab w:val="num" w:pos="1080"/>
-        </w:tabs>
-        <w:ind w:left="1080"/>
-        <w:rPr>
-          <w:rFonts w:cstheme="minorHAnsi"/>
-          <w:sz w:val="22"/>
-          <w:szCs w:val="22"/>
-        </w:rPr>
-      </w:pPr>
-      <w:r>
-        <w:rPr>
-          <w:rFonts w:cstheme="minorHAnsi"/>
-          <w:sz w:val="22"/>
-          <w:szCs w:val="22"/>
-        </w:rPr>
-        <w:t>Humidity</w:t>
-      </w:r>
-    </w:p>
-    <w:p>
-      <w:pPr>
-        <w:pStyle w:val="ListParagraph"/>
-        <w:numPr>
-          <w:ilvl w:val="0"/>
-          <w:numId w:val="40"/>
-        </w:numPr>
-        <w:tabs>
-          <w:tab w:val="clear" w:pos="720"/>
-          <w:tab w:val="num" w:pos="1080"/>
-        </w:tabs>
-        <w:ind w:left="1080"/>
-        <w:rPr>
-          <w:rFonts w:cstheme="minorHAnsi"/>
-          <w:sz w:val="22"/>
-          <w:szCs w:val="22"/>
-        </w:rPr>
-      </w:pPr>
-      <w:r>
-        <w:rPr>
-          <w:rFonts w:cstheme="minorHAnsi"/>
-          <w:sz w:val="22"/>
-          <w:szCs w:val="22"/>
-        </w:rPr>
-        <w:t>Wind Speed</w:t>
-      </w:r>
-    </w:p>
-    <w:p>
-      <w:pPr>
-        <w:pStyle w:val="ListParagraph"/>
-        <w:numPr>
-          <w:ilvl w:val="0"/>
-          <w:numId w:val="40"/>
-        </w:numPr>
-        <w:tabs>
-          <w:tab w:val="clear" w:pos="720"/>
-          <w:tab w:val="num" w:pos="1080"/>
-        </w:tabs>
-        <w:ind w:left="1080"/>
-        <w:rPr>
-          <w:rFonts w:cstheme="minorHAnsi"/>
-          <w:sz w:val="22"/>
-          <w:szCs w:val="22"/>
-        </w:rPr>
-      </w:pPr>
-      <w:r>
-        <w:rPr>
-          <w:rFonts w:cstheme="minorHAnsi"/>
-          <w:sz w:val="22"/>
-          <w:szCs w:val="22"/>
-        </w:rPr>
-        <w:t>Air Pressure</w:t>
-      </w:r>
-    </w:p>
-    <w:p>
-      <w:pPr>
-        <w:pStyle w:val="ListParagraph"/>
-        <w:rPr>
-          <w:rFonts w:cstheme="minorHAnsi"/>
-          <w:sz w:val="22"/>
-          <w:szCs w:val="22"/>
-        </w:rPr>
-      </w:pPr>
-      <w:r>
-        <w:rPr>
-          <w:rFonts w:cstheme="minorHAnsi"/>
+        </w:rPr>
+      </w:pPr>
+      <w:r>
+        <w:rPr>
           <w:b/>
           <w:bCs/>
-          <w:sz w:val="22"/>
-          <w:szCs w:val="22"/>
-        </w:rPr>
-        <w:t>Purpose:</w:t>
-      </w:r>
-      <w:r>
-        <w:rPr>
-          <w:rFonts w:cstheme="minorHAnsi"/>
-          <w:sz w:val="22"/>
-          <w:szCs w:val="22"/>
-        </w:rPr>
-        <w:t xml:space="preserve"> Environmental factors such as temperature and humidity can influence exercise intensity and calorie expenditure. These features will be incorporated to make the prediction model more context-aware and realistic.</w:t>
-      </w:r>
-    </w:p>
-    <w:p>
-      <w:pPr>
-        <w:pStyle w:val="ListParagraph"/>
-        <w:ind w:left="360"/>
-        <w:rPr>
-          <w:rFonts w:cstheme="minorHAnsi"/>
+        </w:rPr>
+        <w:t>Mendeley Gym Recommendation Dataset (AI Coaching Dataset)</w:t>
+      </w:r>
+    </w:p>
+    <w:p>
+      <w:pPr>
+        <w:pStyle w:val="ListParagraph"/>
+        <w:ind w:left="1440"/>
+        <w:rPr>
           <w:b/>
           <w:bCs/>
-          <w:sz w:val="22"/>
-          <w:szCs w:val="22"/>
-        </w:rPr>
-      </w:pPr>
-      <w:r>
-        <w:rPr>
-          <w:rFonts w:cstheme="minorHAnsi"/>
+        </w:rPr>
+      </w:pPr>
+      <w:r>
+        <w:rPr>
           <w:b/>
           <w:bCs/>
-          <w:sz w:val="22"/>
-          <w:szCs w:val="22"/>
-        </w:rPr>
-        <w:t>Combined Dataset Structure</w:t>
-      </w:r>
-    </w:p>
-    <w:p>
-      <w:pPr>
-        <w:pStyle w:val="ListParagraph"/>
-        <w:ind w:left="360"/>
-        <w:rPr>
-          <w:rFonts w:cstheme="minorHAnsi"/>
-          <w:sz w:val="22"/>
-          <w:szCs w:val="22"/>
-        </w:rPr>
-      </w:pPr>
-      <w:r>
-        <w:rPr>
-          <w:rFonts w:cstheme="minorHAnsi"/>
-          <w:sz w:val="22"/>
-          <w:szCs w:val="22"/>
-        </w:rPr>
-        <w:t>The final dataset for the project will merge these sources to create a comprehensive table for model training. A sample structure is as follows:</w:t>
-      </w:r>
-    </w:p>
-    <w:tbl>
-      <w:tblPr>
-        <w:tblStyle w:val="PlainTable4"/>
-        <w:tblW w:w="0" w:type="auto"/>
-        <w:tblInd w:w="1332" w:type="dxa"/>
-        <w:tblLook w:val="04A0" w:firstRow="1" w:lastRow="0" w:firstColumn="1" w:lastColumn="0" w:noHBand="0" w:noVBand="1"/>
-      </w:tblPr>
-      <w:tblGrid>
-        <w:gridCol w:w="2259"/>
-        <w:gridCol w:w="3780"/>
-      </w:tblGrid>
-      <w:tr>
-        <w:trPr>
-          <w:cnfStyle w:val="100000000000" w:firstRow="1" w:lastRow="0" w:firstColumn="0" w:lastColumn="0" w:oddVBand="0" w:evenVBand="0" w:oddHBand="0" w:evenHBand="0" w:firstRowFirstColumn="0" w:firstRowLastColumn="0" w:lastRowFirstColumn="0" w:lastRowLastColumn="0"/>
-          <w:trHeight w:val="340"/>
-        </w:trPr>
-        <w:tc>
-          <w:tcPr>
-            <w:cnfStyle w:val="001000000000" w:firstRow="0" w:lastRow="0" w:firstColumn="1" w:lastColumn="0" w:oddVBand="0" w:evenVBand="0" w:oddHBand="0" w:evenHBand="0" w:firstRowFirstColumn="0" w:firstRowLastColumn="0" w:lastRowFirstColumn="0" w:lastRowLastColumn="0"/>
-            <w:tcW w:w="0" w:type="auto"/>
-            <w:hideMark/>
-          </w:tcPr>
-          <w:p>
-            <w:pPr>
-              <w:pStyle w:val="ListParagraph"/>
-              <w:ind w:left="360"/>
-              <w:rPr>
-                <w:rFonts w:cstheme="minorHAnsi"/>
-                <w:sz w:val="22"/>
-                <w:szCs w:val="22"/>
-              </w:rPr>
-            </w:pPr>
-            <w:r>
-              <w:rPr>
-                <w:rFonts w:cstheme="minorHAnsi"/>
-                <w:sz w:val="22"/>
-                <w:szCs w:val="22"/>
-              </w:rPr>
-              <w:t>Feature</w:t>
-            </w:r>
-          </w:p>
-        </w:tc>
-        <w:tc>
-          <w:tcPr>
-            <w:tcW w:w="0" w:type="auto"/>
-            <w:hideMark/>
-          </w:tcPr>
-          <w:p>
-            <w:pPr>
-              <w:pStyle w:val="ListParagraph"/>
-              <w:ind w:left="360"/>
-              <w:cnfStyle w:val="100000000000" w:firstRow="1" w:lastRow="0" w:firstColumn="0" w:lastColumn="0" w:oddVBand="0" w:evenVBand="0" w:oddHBand="0" w:evenHBand="0" w:firstRowFirstColumn="0" w:firstRowLastColumn="0" w:lastRowFirstColumn="0" w:lastRowLastColumn="0"/>
-              <w:rPr>
-                <w:rFonts w:cstheme="minorHAnsi"/>
-                <w:sz w:val="22"/>
-                <w:szCs w:val="22"/>
-              </w:rPr>
-            </w:pPr>
-            <w:r>
-              <w:rPr>
-                <w:rFonts w:cstheme="minorHAnsi"/>
-                <w:sz w:val="22"/>
-                <w:szCs w:val="22"/>
-              </w:rPr>
-              <w:t>Source</w:t>
-            </w:r>
-          </w:p>
-        </w:tc>
-      </w:tr>
-      <w:tr>
-        <w:trPr>
-          <w:cnfStyle w:val="000000100000" w:firstRow="0" w:lastRow="0" w:firstColumn="0" w:lastColumn="0" w:oddVBand="0" w:evenVBand="0" w:oddHBand="1" w:evenHBand="0" w:firstRowFirstColumn="0" w:firstRowLastColumn="0" w:lastRowFirstColumn="0" w:lastRowLastColumn="0"/>
-          <w:trHeight w:val="340"/>
-        </w:trPr>
-        <w:tc>
-          <w:tcPr>
-            <w:cnfStyle w:val="001000000000" w:firstRow="0" w:lastRow="0" w:firstColumn="1" w:lastColumn="0" w:oddVBand="0" w:evenVBand="0" w:oddHBand="0" w:evenHBand="0" w:firstRowFirstColumn="0" w:firstRowLastColumn="0" w:lastRowFirstColumn="0" w:lastRowLastColumn="0"/>
-            <w:tcW w:w="0" w:type="auto"/>
-            <w:hideMark/>
-          </w:tcPr>
-          <w:p>
-            <w:pPr>
-              <w:pStyle w:val="ListParagraph"/>
-              <w:ind w:left="360"/>
-              <w:rPr>
-                <w:rFonts w:cstheme="minorHAnsi"/>
-                <w:sz w:val="22"/>
-                <w:szCs w:val="22"/>
-              </w:rPr>
-            </w:pPr>
-            <w:r>
-              <w:rPr>
-                <w:rFonts w:cstheme="minorHAnsi"/>
-                <w:sz w:val="22"/>
-                <w:szCs w:val="22"/>
-              </w:rPr>
-              <w:t>Age</w:t>
-            </w:r>
-          </w:p>
-        </w:tc>
-        <w:tc>
-          <w:tcPr>
-            <w:tcW w:w="0" w:type="auto"/>
-            <w:hideMark/>
-          </w:tcPr>
-          <w:p>
-            <w:pPr>
-              <w:pStyle w:val="ListParagraph"/>
-              <w:ind w:left="360"/>
-              <w:cnfStyle w:val="000000100000" w:firstRow="0" w:lastRow="0" w:firstColumn="0" w:lastColumn="0" w:oddVBand="0" w:evenVBand="0" w:oddHBand="1" w:evenHBand="0" w:firstRowFirstColumn="0" w:firstRowLastColumn="0" w:lastRowFirstColumn="0" w:lastRowLastColumn="0"/>
-              <w:rPr>
-                <w:rFonts w:cstheme="minorHAnsi"/>
-                <w:sz w:val="22"/>
-                <w:szCs w:val="22"/>
-              </w:rPr>
-            </w:pPr>
-            <w:r>
-              <w:rPr>
-                <w:rFonts w:cstheme="minorHAnsi"/>
-                <w:sz w:val="22"/>
-                <w:szCs w:val="22"/>
-              </w:rPr>
-              <w:t>Kaggle Calorie Dataset</w:t>
-            </w:r>
-          </w:p>
-        </w:tc>
-      </w:tr>
-      <w:tr>
-        <w:trPr>
-          <w:trHeight w:val="340"/>
-        </w:trPr>
-        <w:tc>
-          <w:tcPr>
-            <w:cnfStyle w:val="001000000000" w:firstRow="0" w:lastRow="0" w:firstColumn="1" w:lastColumn="0" w:oddVBand="0" w:evenVBand="0" w:oddHBand="0" w:evenHBand="0" w:firstRowFirstColumn="0" w:firstRowLastColumn="0" w:lastRowFirstColumn="0" w:lastRowLastColumn="0"/>
-            <w:tcW w:w="0" w:type="auto"/>
-            <w:hideMark/>
-          </w:tcPr>
-          <w:p>
-            <w:pPr>
-              <w:pStyle w:val="ListParagraph"/>
-              <w:ind w:left="360"/>
-              <w:rPr>
-                <w:rFonts w:cstheme="minorHAnsi"/>
-                <w:sz w:val="22"/>
-                <w:szCs w:val="22"/>
-              </w:rPr>
-            </w:pPr>
-            <w:r>
-              <w:rPr>
-                <w:rFonts w:cstheme="minorHAnsi"/>
-                <w:sz w:val="22"/>
-                <w:szCs w:val="22"/>
-              </w:rPr>
-              <w:lastRenderedPageBreak/>
-              <w:t>Gender</w:t>
-            </w:r>
-          </w:p>
-        </w:tc>
-        <w:tc>
-          <w:tcPr>
-            <w:tcW w:w="0" w:type="auto"/>
-            <w:hideMark/>
-          </w:tcPr>
-          <w:p>
-            <w:pPr>
-              <w:pStyle w:val="ListParagraph"/>
-              <w:ind w:left="360"/>
-              <w:cnfStyle w:val="000000000000" w:firstRow="0" w:lastRow="0" w:firstColumn="0" w:lastColumn="0" w:oddVBand="0" w:evenVBand="0" w:oddHBand="0" w:evenHBand="0" w:firstRowFirstColumn="0" w:firstRowLastColumn="0" w:lastRowFirstColumn="0" w:lastRowLastColumn="0"/>
-              <w:rPr>
-                <w:rFonts w:cstheme="minorHAnsi"/>
-                <w:sz w:val="22"/>
-                <w:szCs w:val="22"/>
-              </w:rPr>
-            </w:pPr>
-            <w:r>
-              <w:rPr>
-                <w:rFonts w:cstheme="minorHAnsi"/>
-                <w:sz w:val="22"/>
-                <w:szCs w:val="22"/>
-              </w:rPr>
-              <w:t>Kaggle Calorie Dataset</w:t>
-            </w:r>
-          </w:p>
-        </w:tc>
-      </w:tr>
-      <w:tr>
-        <w:trPr>
-          <w:cnfStyle w:val="000000100000" w:firstRow="0" w:lastRow="0" w:firstColumn="0" w:lastColumn="0" w:oddVBand="0" w:evenVBand="0" w:oddHBand="1" w:evenHBand="0" w:firstRowFirstColumn="0" w:firstRowLastColumn="0" w:lastRowFirstColumn="0" w:lastRowLastColumn="0"/>
-          <w:trHeight w:val="340"/>
-        </w:trPr>
-        <w:tc>
-          <w:tcPr>
-            <w:cnfStyle w:val="001000000000" w:firstRow="0" w:lastRow="0" w:firstColumn="1" w:lastColumn="0" w:oddVBand="0" w:evenVBand="0" w:oddHBand="0" w:evenHBand="0" w:firstRowFirstColumn="0" w:firstRowLastColumn="0" w:lastRowFirstColumn="0" w:lastRowLastColumn="0"/>
-            <w:tcW w:w="0" w:type="auto"/>
-            <w:hideMark/>
-          </w:tcPr>
-          <w:p>
-            <w:pPr>
-              <w:pStyle w:val="ListParagraph"/>
-              <w:ind w:left="360"/>
-              <w:rPr>
-                <w:rFonts w:cstheme="minorHAnsi"/>
-                <w:sz w:val="22"/>
-                <w:szCs w:val="22"/>
-              </w:rPr>
-            </w:pPr>
-            <w:r>
-              <w:rPr>
-                <w:rFonts w:cstheme="minorHAnsi"/>
-                <w:sz w:val="22"/>
-                <w:szCs w:val="22"/>
-              </w:rPr>
-              <w:t>Height</w:t>
-            </w:r>
-          </w:p>
-        </w:tc>
-        <w:tc>
-          <w:tcPr>
-            <w:tcW w:w="0" w:type="auto"/>
-            <w:hideMark/>
-          </w:tcPr>
-          <w:p>
-            <w:pPr>
-              <w:pStyle w:val="ListParagraph"/>
-              <w:ind w:left="360"/>
-              <w:cnfStyle w:val="000000100000" w:firstRow="0" w:lastRow="0" w:firstColumn="0" w:lastColumn="0" w:oddVBand="0" w:evenVBand="0" w:oddHBand="1" w:evenHBand="0" w:firstRowFirstColumn="0" w:firstRowLastColumn="0" w:lastRowFirstColumn="0" w:lastRowLastColumn="0"/>
-              <w:rPr>
-                <w:rFonts w:cstheme="minorHAnsi"/>
-                <w:sz w:val="22"/>
-                <w:szCs w:val="22"/>
-              </w:rPr>
-            </w:pPr>
-            <w:r>
-              <w:rPr>
-                <w:rFonts w:cstheme="minorHAnsi"/>
-                <w:sz w:val="22"/>
-                <w:szCs w:val="22"/>
-              </w:rPr>
-              <w:t>Kaggle Calorie Dataset</w:t>
-            </w:r>
-          </w:p>
-        </w:tc>
-      </w:tr>
-      <w:tr>
-        <w:trPr>
-          <w:trHeight w:val="340"/>
-        </w:trPr>
-        <w:tc>
-          <w:tcPr>
-            <w:cnfStyle w:val="001000000000" w:firstRow="0" w:lastRow="0" w:firstColumn="1" w:lastColumn="0" w:oddVBand="0" w:evenVBand="0" w:oddHBand="0" w:evenHBand="0" w:firstRowFirstColumn="0" w:firstRowLastColumn="0" w:lastRowFirstColumn="0" w:lastRowLastColumn="0"/>
-            <w:tcW w:w="0" w:type="auto"/>
-            <w:hideMark/>
-          </w:tcPr>
-          <w:p>
-            <w:pPr>
-              <w:pStyle w:val="ListParagraph"/>
-              <w:ind w:left="360"/>
-              <w:rPr>
-                <w:rFonts w:cstheme="minorHAnsi"/>
-                <w:sz w:val="22"/>
-                <w:szCs w:val="22"/>
-              </w:rPr>
-            </w:pPr>
-            <w:r>
-              <w:rPr>
-                <w:rFonts w:cstheme="minorHAnsi"/>
-                <w:sz w:val="22"/>
-                <w:szCs w:val="22"/>
-              </w:rPr>
-              <w:t>Weight</w:t>
-            </w:r>
-          </w:p>
-        </w:tc>
-        <w:tc>
-          <w:tcPr>
-            <w:tcW w:w="0" w:type="auto"/>
-            <w:hideMark/>
-          </w:tcPr>
-          <w:p>
-            <w:pPr>
-              <w:pStyle w:val="ListParagraph"/>
-              <w:ind w:left="360"/>
-              <w:cnfStyle w:val="000000000000" w:firstRow="0" w:lastRow="0" w:firstColumn="0" w:lastColumn="0" w:oddVBand="0" w:evenVBand="0" w:oddHBand="0" w:evenHBand="0" w:firstRowFirstColumn="0" w:firstRowLastColumn="0" w:lastRowFirstColumn="0" w:lastRowLastColumn="0"/>
-              <w:rPr>
-                <w:rFonts w:cstheme="minorHAnsi"/>
-                <w:sz w:val="22"/>
-                <w:szCs w:val="22"/>
-              </w:rPr>
-            </w:pPr>
-            <w:r>
-              <w:rPr>
-                <w:rFonts w:cstheme="minorHAnsi"/>
-                <w:sz w:val="22"/>
-                <w:szCs w:val="22"/>
-              </w:rPr>
-              <w:t>Kaggle Calorie Dataset</w:t>
-            </w:r>
-          </w:p>
-        </w:tc>
-      </w:tr>
-      <w:tr>
-        <w:trPr>
-          <w:cnfStyle w:val="000000100000" w:firstRow="0" w:lastRow="0" w:firstColumn="0" w:lastColumn="0" w:oddVBand="0" w:evenVBand="0" w:oddHBand="1" w:evenHBand="0" w:firstRowFirstColumn="0" w:firstRowLastColumn="0" w:lastRowFirstColumn="0" w:lastRowLastColumn="0"/>
-          <w:trHeight w:val="340"/>
-        </w:trPr>
-        <w:tc>
-          <w:tcPr>
-            <w:cnfStyle w:val="001000000000" w:firstRow="0" w:lastRow="0" w:firstColumn="1" w:lastColumn="0" w:oddVBand="0" w:evenVBand="0" w:oddHBand="0" w:evenHBand="0" w:firstRowFirstColumn="0" w:firstRowLastColumn="0" w:lastRowFirstColumn="0" w:lastRowLastColumn="0"/>
-            <w:tcW w:w="0" w:type="auto"/>
-            <w:hideMark/>
-          </w:tcPr>
-          <w:p>
-            <w:pPr>
-              <w:pStyle w:val="ListParagraph"/>
-              <w:ind w:left="360"/>
-              <w:rPr>
-                <w:rFonts w:cstheme="minorHAnsi"/>
-                <w:sz w:val="22"/>
-                <w:szCs w:val="22"/>
-              </w:rPr>
-            </w:pPr>
-            <w:r>
-              <w:rPr>
-                <w:rFonts w:cstheme="minorHAnsi"/>
-                <w:sz w:val="22"/>
-                <w:szCs w:val="22"/>
-              </w:rPr>
-              <w:t>Duration</w:t>
-            </w:r>
-          </w:p>
-        </w:tc>
-        <w:tc>
-          <w:tcPr>
-            <w:tcW w:w="0" w:type="auto"/>
-            <w:hideMark/>
-          </w:tcPr>
-          <w:p>
-            <w:pPr>
-              <w:pStyle w:val="ListParagraph"/>
-              <w:ind w:left="360"/>
-              <w:cnfStyle w:val="000000100000" w:firstRow="0" w:lastRow="0" w:firstColumn="0" w:lastColumn="0" w:oddVBand="0" w:evenVBand="0" w:oddHBand="1" w:evenHBand="0" w:firstRowFirstColumn="0" w:firstRowLastColumn="0" w:lastRowFirstColumn="0" w:lastRowLastColumn="0"/>
-              <w:rPr>
-                <w:rFonts w:cstheme="minorHAnsi"/>
-                <w:sz w:val="22"/>
-                <w:szCs w:val="22"/>
-              </w:rPr>
-            </w:pPr>
-            <w:r>
-              <w:rPr>
-                <w:rFonts w:cstheme="minorHAnsi"/>
-                <w:sz w:val="22"/>
-                <w:szCs w:val="22"/>
-              </w:rPr>
-              <w:t>Kaggle Calorie Dataset</w:t>
-            </w:r>
-          </w:p>
-        </w:tc>
-      </w:tr>
-      <w:tr>
-        <w:trPr>
-          <w:trHeight w:val="340"/>
-        </w:trPr>
-        <w:tc>
-          <w:tcPr>
-            <w:cnfStyle w:val="001000000000" w:firstRow="0" w:lastRow="0" w:firstColumn="1" w:lastColumn="0" w:oddVBand="0" w:evenVBand="0" w:oddHBand="0" w:evenHBand="0" w:firstRowFirstColumn="0" w:firstRowLastColumn="0" w:lastRowFirstColumn="0" w:lastRowLastColumn="0"/>
-            <w:tcW w:w="0" w:type="auto"/>
-            <w:hideMark/>
-          </w:tcPr>
-          <w:p>
-            <w:pPr>
-              <w:pStyle w:val="ListParagraph"/>
-              <w:ind w:left="360"/>
-              <w:rPr>
-                <w:rFonts w:cstheme="minorHAnsi"/>
-                <w:sz w:val="22"/>
-                <w:szCs w:val="22"/>
-              </w:rPr>
-            </w:pPr>
-            <w:r>
-              <w:rPr>
-                <w:rFonts w:cstheme="minorHAnsi"/>
-                <w:sz w:val="22"/>
-                <w:szCs w:val="22"/>
-              </w:rPr>
-              <w:t>Heart Rate</w:t>
-            </w:r>
-          </w:p>
-        </w:tc>
-        <w:tc>
-          <w:tcPr>
-            <w:tcW w:w="0" w:type="auto"/>
-            <w:hideMark/>
-          </w:tcPr>
-          <w:p>
-            <w:pPr>
-              <w:pStyle w:val="ListParagraph"/>
-              <w:ind w:left="360"/>
-              <w:cnfStyle w:val="000000000000" w:firstRow="0" w:lastRow="0" w:firstColumn="0" w:lastColumn="0" w:oddVBand="0" w:evenVBand="0" w:oddHBand="0" w:evenHBand="0" w:firstRowFirstColumn="0" w:firstRowLastColumn="0" w:lastRowFirstColumn="0" w:lastRowLastColumn="0"/>
-              <w:rPr>
-                <w:rFonts w:cstheme="minorHAnsi"/>
-                <w:sz w:val="22"/>
-                <w:szCs w:val="22"/>
-              </w:rPr>
-            </w:pPr>
-            <w:r>
-              <w:rPr>
-                <w:rFonts w:cstheme="minorHAnsi"/>
-                <w:sz w:val="22"/>
-                <w:szCs w:val="22"/>
-              </w:rPr>
-              <w:t>Kaggle / Fitbit</w:t>
-            </w:r>
-          </w:p>
-        </w:tc>
-      </w:tr>
-      <w:tr>
-        <w:trPr>
-          <w:cnfStyle w:val="000000100000" w:firstRow="0" w:lastRow="0" w:firstColumn="0" w:lastColumn="0" w:oddVBand="0" w:evenVBand="0" w:oddHBand="1" w:evenHBand="0" w:firstRowFirstColumn="0" w:firstRowLastColumn="0" w:lastRowFirstColumn="0" w:lastRowLastColumn="0"/>
-          <w:trHeight w:val="340"/>
-        </w:trPr>
-        <w:tc>
-          <w:tcPr>
-            <w:cnfStyle w:val="001000000000" w:firstRow="0" w:lastRow="0" w:firstColumn="1" w:lastColumn="0" w:oddVBand="0" w:evenVBand="0" w:oddHBand="0" w:evenHBand="0" w:firstRowFirstColumn="0" w:firstRowLastColumn="0" w:lastRowFirstColumn="0" w:lastRowLastColumn="0"/>
-            <w:tcW w:w="0" w:type="auto"/>
-            <w:hideMark/>
-          </w:tcPr>
-          <w:p>
-            <w:pPr>
-              <w:pStyle w:val="ListParagraph"/>
-              <w:ind w:left="360"/>
-              <w:rPr>
-                <w:rFonts w:cstheme="minorHAnsi"/>
-                <w:sz w:val="22"/>
-                <w:szCs w:val="22"/>
-              </w:rPr>
-            </w:pPr>
-            <w:r>
-              <w:rPr>
-                <w:rFonts w:cstheme="minorHAnsi"/>
-                <w:sz w:val="22"/>
-                <w:szCs w:val="22"/>
-              </w:rPr>
-              <w:t>Body Temperature</w:t>
-            </w:r>
-          </w:p>
-        </w:tc>
-        <w:tc>
-          <w:tcPr>
-            <w:tcW w:w="0" w:type="auto"/>
-            <w:hideMark/>
-          </w:tcPr>
-          <w:p>
-            <w:pPr>
-              <w:pStyle w:val="ListParagraph"/>
-              <w:ind w:left="360"/>
-              <w:cnfStyle w:val="000000100000" w:firstRow="0" w:lastRow="0" w:firstColumn="0" w:lastColumn="0" w:oddVBand="0" w:evenVBand="0" w:oddHBand="1" w:evenHBand="0" w:firstRowFirstColumn="0" w:firstRowLastColumn="0" w:lastRowFirstColumn="0" w:lastRowLastColumn="0"/>
-              <w:rPr>
-                <w:rFonts w:cstheme="minorHAnsi"/>
-                <w:sz w:val="22"/>
-                <w:szCs w:val="22"/>
-              </w:rPr>
-            </w:pPr>
-            <w:r>
-              <w:rPr>
-                <w:rFonts w:cstheme="minorHAnsi"/>
-                <w:sz w:val="22"/>
-                <w:szCs w:val="22"/>
-              </w:rPr>
-              <w:t>Kaggle Calorie Dataset</w:t>
-            </w:r>
-          </w:p>
-        </w:tc>
-      </w:tr>
-      <w:tr>
-        <w:trPr>
-          <w:trHeight w:val="340"/>
-        </w:trPr>
-        <w:tc>
-          <w:tcPr>
-            <w:cnfStyle w:val="001000000000" w:firstRow="0" w:lastRow="0" w:firstColumn="1" w:lastColumn="0" w:oddVBand="0" w:evenVBand="0" w:oddHBand="0" w:evenHBand="0" w:firstRowFirstColumn="0" w:firstRowLastColumn="0" w:lastRowFirstColumn="0" w:lastRowLastColumn="0"/>
-            <w:tcW w:w="0" w:type="auto"/>
-            <w:hideMark/>
-          </w:tcPr>
-          <w:p>
-            <w:pPr>
-              <w:pStyle w:val="ListParagraph"/>
-              <w:ind w:left="360"/>
-              <w:rPr>
-                <w:rFonts w:cstheme="minorHAnsi"/>
-                <w:sz w:val="22"/>
-                <w:szCs w:val="22"/>
-              </w:rPr>
-            </w:pPr>
-            <w:r>
-              <w:rPr>
-                <w:rFonts w:cstheme="minorHAnsi"/>
-                <w:sz w:val="22"/>
-                <w:szCs w:val="22"/>
-              </w:rPr>
-              <w:t>Activity Type</w:t>
-            </w:r>
-          </w:p>
-        </w:tc>
-        <w:tc>
-          <w:tcPr>
-            <w:tcW w:w="0" w:type="auto"/>
-            <w:hideMark/>
-          </w:tcPr>
-          <w:p>
-            <w:pPr>
-              <w:pStyle w:val="ListParagraph"/>
-              <w:ind w:left="360"/>
-              <w:cnfStyle w:val="000000000000" w:firstRow="0" w:lastRow="0" w:firstColumn="0" w:lastColumn="0" w:oddVBand="0" w:evenVBand="0" w:oddHBand="0" w:evenHBand="0" w:firstRowFirstColumn="0" w:firstRowLastColumn="0" w:lastRowFirstColumn="0" w:lastRowLastColumn="0"/>
-              <w:rPr>
-                <w:rFonts w:cstheme="minorHAnsi"/>
-                <w:sz w:val="22"/>
-                <w:szCs w:val="22"/>
-              </w:rPr>
-            </w:pPr>
-            <w:r>
-              <w:rPr>
-                <w:rFonts w:cstheme="minorHAnsi"/>
-                <w:sz w:val="22"/>
-                <w:szCs w:val="22"/>
-              </w:rPr>
-              <w:t>Human Activity Recognition Dataset</w:t>
-            </w:r>
-          </w:p>
-        </w:tc>
-      </w:tr>
-      <w:tr>
-        <w:trPr>
-          <w:cnfStyle w:val="000000100000" w:firstRow="0" w:lastRow="0" w:firstColumn="0" w:lastColumn="0" w:oddVBand="0" w:evenVBand="0" w:oddHBand="1" w:evenHBand="0" w:firstRowFirstColumn="0" w:firstRowLastColumn="0" w:lastRowFirstColumn="0" w:lastRowLastColumn="0"/>
-          <w:trHeight w:val="340"/>
-        </w:trPr>
-        <w:tc>
-          <w:tcPr>
-            <w:cnfStyle w:val="001000000000" w:firstRow="0" w:lastRow="0" w:firstColumn="1" w:lastColumn="0" w:oddVBand="0" w:evenVBand="0" w:oddHBand="0" w:evenHBand="0" w:firstRowFirstColumn="0" w:firstRowLastColumn="0" w:lastRowFirstColumn="0" w:lastRowLastColumn="0"/>
-            <w:tcW w:w="0" w:type="auto"/>
-            <w:hideMark/>
-          </w:tcPr>
-          <w:p>
-            <w:pPr>
-              <w:pStyle w:val="ListParagraph"/>
-              <w:ind w:left="360"/>
-              <w:rPr>
-                <w:rFonts w:cstheme="minorHAnsi"/>
-                <w:sz w:val="22"/>
-                <w:szCs w:val="22"/>
-              </w:rPr>
-            </w:pPr>
-            <w:r>
-              <w:rPr>
-                <w:rFonts w:cstheme="minorHAnsi"/>
-                <w:sz w:val="22"/>
-                <w:szCs w:val="22"/>
-              </w:rPr>
-              <w:t>Steps</w:t>
-            </w:r>
-          </w:p>
-        </w:tc>
-        <w:tc>
-          <w:tcPr>
-            <w:tcW w:w="0" w:type="auto"/>
-            <w:hideMark/>
-          </w:tcPr>
-          <w:p>
-            <w:pPr>
-              <w:pStyle w:val="ListParagraph"/>
-              <w:ind w:left="360"/>
-              <w:cnfStyle w:val="000000100000" w:firstRow="0" w:lastRow="0" w:firstColumn="0" w:lastColumn="0" w:oddVBand="0" w:evenVBand="0" w:oddHBand="1" w:evenHBand="0" w:firstRowFirstColumn="0" w:firstRowLastColumn="0" w:lastRowFirstColumn="0" w:lastRowLastColumn="0"/>
-              <w:rPr>
-                <w:rFonts w:cstheme="minorHAnsi"/>
-                <w:sz w:val="22"/>
-                <w:szCs w:val="22"/>
-              </w:rPr>
-            </w:pPr>
-            <w:r>
-              <w:rPr>
-                <w:rFonts w:cstheme="minorHAnsi"/>
-                <w:sz w:val="22"/>
-                <w:szCs w:val="22"/>
-              </w:rPr>
-              <w:t>Fitbit Dataset</w:t>
-            </w:r>
-          </w:p>
-        </w:tc>
-      </w:tr>
-      <w:tr>
-        <w:trPr>
-          <w:trHeight w:val="340"/>
-        </w:trPr>
-        <w:tc>
-          <w:tcPr>
-            <w:cnfStyle w:val="001000000000" w:firstRow="0" w:lastRow="0" w:firstColumn="1" w:lastColumn="0" w:oddVBand="0" w:evenVBand="0" w:oddHBand="0" w:evenHBand="0" w:firstRowFirstColumn="0" w:firstRowLastColumn="0" w:lastRowFirstColumn="0" w:lastRowLastColumn="0"/>
-            <w:tcW w:w="0" w:type="auto"/>
-            <w:hideMark/>
-          </w:tcPr>
-          <w:p>
-            <w:pPr>
-              <w:pStyle w:val="ListParagraph"/>
-              <w:ind w:left="360"/>
-              <w:rPr>
-                <w:rFonts w:cstheme="minorHAnsi"/>
-                <w:sz w:val="22"/>
-                <w:szCs w:val="22"/>
-              </w:rPr>
-            </w:pPr>
-            <w:r>
-              <w:rPr>
-                <w:rFonts w:cstheme="minorHAnsi"/>
-                <w:sz w:val="22"/>
-                <w:szCs w:val="22"/>
-              </w:rPr>
-              <w:t>Distance</w:t>
-            </w:r>
-          </w:p>
-        </w:tc>
-        <w:tc>
-          <w:tcPr>
-            <w:tcW w:w="0" w:type="auto"/>
-            <w:hideMark/>
-          </w:tcPr>
-          <w:p>
-            <w:pPr>
-              <w:pStyle w:val="ListParagraph"/>
-              <w:ind w:left="360"/>
-              <w:cnfStyle w:val="000000000000" w:firstRow="0" w:lastRow="0" w:firstColumn="0" w:lastColumn="0" w:oddVBand="0" w:evenVBand="0" w:oddHBand="0" w:evenHBand="0" w:firstRowFirstColumn="0" w:firstRowLastColumn="0" w:lastRowFirstColumn="0" w:lastRowLastColumn="0"/>
-              <w:rPr>
-                <w:rFonts w:cstheme="minorHAnsi"/>
-                <w:sz w:val="22"/>
-                <w:szCs w:val="22"/>
-              </w:rPr>
-            </w:pPr>
-            <w:r>
-              <w:rPr>
-                <w:rFonts w:cstheme="minorHAnsi"/>
-                <w:sz w:val="22"/>
-                <w:szCs w:val="22"/>
-              </w:rPr>
-              <w:t>Fitbit Dataset</w:t>
-            </w:r>
-          </w:p>
-        </w:tc>
-      </w:tr>
-      <w:tr>
-        <w:trPr>
-          <w:cnfStyle w:val="000000100000" w:firstRow="0" w:lastRow="0" w:firstColumn="0" w:lastColumn="0" w:oddVBand="0" w:evenVBand="0" w:oddHBand="1" w:evenHBand="0" w:firstRowFirstColumn="0" w:firstRowLastColumn="0" w:lastRowFirstColumn="0" w:lastRowLastColumn="0"/>
-          <w:trHeight w:val="340"/>
-        </w:trPr>
-        <w:tc>
-          <w:tcPr>
-            <w:cnfStyle w:val="001000000000" w:firstRow="0" w:lastRow="0" w:firstColumn="1" w:lastColumn="0" w:oddVBand="0" w:evenVBand="0" w:oddHBand="0" w:evenHBand="0" w:firstRowFirstColumn="0" w:firstRowLastColumn="0" w:lastRowFirstColumn="0" w:lastRowLastColumn="0"/>
-            <w:tcW w:w="0" w:type="auto"/>
-            <w:hideMark/>
-          </w:tcPr>
-          <w:p>
-            <w:pPr>
-              <w:pStyle w:val="ListParagraph"/>
-              <w:ind w:left="360"/>
-              <w:rPr>
-                <w:rFonts w:cstheme="minorHAnsi"/>
-                <w:sz w:val="22"/>
-                <w:szCs w:val="22"/>
-              </w:rPr>
-            </w:pPr>
-            <w:r>
-              <w:rPr>
-                <w:rFonts w:cstheme="minorHAnsi"/>
-                <w:sz w:val="22"/>
-                <w:szCs w:val="22"/>
-              </w:rPr>
-              <w:t>Temperature</w:t>
-            </w:r>
-          </w:p>
-        </w:tc>
-        <w:tc>
-          <w:tcPr>
-            <w:tcW w:w="0" w:type="auto"/>
-            <w:hideMark/>
-          </w:tcPr>
-          <w:p>
-            <w:pPr>
-              <w:pStyle w:val="ListParagraph"/>
-              <w:ind w:left="360"/>
-              <w:cnfStyle w:val="000000100000" w:firstRow="0" w:lastRow="0" w:firstColumn="0" w:lastColumn="0" w:oddVBand="0" w:evenVBand="0" w:oddHBand="1" w:evenHBand="0" w:firstRowFirstColumn="0" w:firstRowLastColumn="0" w:lastRowFirstColumn="0" w:lastRowLastColumn="0"/>
-              <w:rPr>
-                <w:rFonts w:cstheme="minorHAnsi"/>
-                <w:sz w:val="22"/>
-                <w:szCs w:val="22"/>
-              </w:rPr>
-            </w:pPr>
-            <w:r>
-              <w:rPr>
-                <w:rFonts w:cstheme="minorHAnsi"/>
-                <w:sz w:val="22"/>
-                <w:szCs w:val="22"/>
-              </w:rPr>
-              <w:t>Weather API</w:t>
-            </w:r>
-          </w:p>
-        </w:tc>
-      </w:tr>
-      <w:tr>
-        <w:trPr>
-          <w:trHeight w:val="340"/>
-        </w:trPr>
-        <w:tc>
-          <w:tcPr>
-            <w:cnfStyle w:val="001000000000" w:firstRow="0" w:lastRow="0" w:firstColumn="1" w:lastColumn="0" w:oddVBand="0" w:evenVBand="0" w:oddHBand="0" w:evenHBand="0" w:firstRowFirstColumn="0" w:firstRowLastColumn="0" w:lastRowFirstColumn="0" w:lastRowLastColumn="0"/>
-            <w:tcW w:w="0" w:type="auto"/>
-            <w:hideMark/>
-          </w:tcPr>
-          <w:p>
-            <w:pPr>
-              <w:pStyle w:val="ListParagraph"/>
-              <w:ind w:left="360"/>
-              <w:rPr>
-                <w:rFonts w:cstheme="minorHAnsi"/>
-                <w:sz w:val="22"/>
-                <w:szCs w:val="22"/>
-              </w:rPr>
-            </w:pPr>
-            <w:r>
-              <w:rPr>
-                <w:rFonts w:cstheme="minorHAnsi"/>
-                <w:sz w:val="22"/>
-                <w:szCs w:val="22"/>
-              </w:rPr>
-              <w:t>Humidity</w:t>
-            </w:r>
-          </w:p>
-        </w:tc>
-        <w:tc>
-          <w:tcPr>
-            <w:tcW w:w="0" w:type="auto"/>
-            <w:hideMark/>
-          </w:tcPr>
-          <w:p>
-            <w:pPr>
-              <w:pStyle w:val="ListParagraph"/>
-              <w:ind w:left="360"/>
-              <w:cnfStyle w:val="000000000000" w:firstRow="0" w:lastRow="0" w:firstColumn="0" w:lastColumn="0" w:oddVBand="0" w:evenVBand="0" w:oddHBand="0" w:evenHBand="0" w:firstRowFirstColumn="0" w:firstRowLastColumn="0" w:lastRowFirstColumn="0" w:lastRowLastColumn="0"/>
-              <w:rPr>
-                <w:rFonts w:cstheme="minorHAnsi"/>
-                <w:sz w:val="22"/>
-                <w:szCs w:val="22"/>
-              </w:rPr>
-            </w:pPr>
-            <w:r>
-              <w:rPr>
-                <w:rFonts w:cstheme="minorHAnsi"/>
-                <w:sz w:val="22"/>
-                <w:szCs w:val="22"/>
-              </w:rPr>
-              <w:t>Weather API</w:t>
-            </w:r>
-          </w:p>
-        </w:tc>
-      </w:tr>
-    </w:tbl>
-    <w:p>
-      <w:pPr>
-        <w:pStyle w:val="ListParagraph"/>
-        <w:ind w:left="360"/>
-        <w:rPr>
-          <w:rFonts w:cstheme="minorHAnsi"/>
-          <w:sz w:val="22"/>
-          <w:szCs w:val="22"/>
-        </w:rPr>
-      </w:pPr>
-    </w:p>
-    <w:p>
-      <w:pPr>
-        <w:pStyle w:val="ListParagraph"/>
-        <w:ind w:left="360"/>
-        <w:rPr>
-          <w:rFonts w:cstheme="minorHAnsi"/>
-          <w:sz w:val="22"/>
-          <w:szCs w:val="22"/>
-        </w:rPr>
-      </w:pPr>
-      <w:r>
-        <w:rPr>
-          <w:rFonts w:cstheme="minorHAnsi"/>
-          <w:sz w:val="22"/>
-          <w:szCs w:val="22"/>
-        </w:rPr>
-        <w:t xml:space="preserve">This integrated approach ensures that the model will consider </w:t>
-      </w:r>
-      <w:r>
-        <w:rPr>
-          <w:rFonts w:cstheme="minorHAnsi"/>
+        </w:rPr>
+        <w:t xml:space="preserve">Link: </w:t>
+      </w:r>
+      <w:r>
+        <w:rPr>
+          <w:i/>
+          <w:iCs/>
+        </w:rPr>
+        <w:t>data.mendeley.com/datasets/zw8mtbm5b9/1</w:t>
+      </w:r>
+      <w:r>
+        <w:br/>
+      </w:r>
+      <w:r>
+        <w:rPr>
           <w:b/>
           <w:bCs/>
-          <w:sz w:val="22"/>
-          <w:szCs w:val="22"/>
-        </w:rPr>
-        <w:t>physiological, activity, and environmental factors</w:t>
-      </w:r>
-      <w:r>
-        <w:rPr>
-          <w:rFonts w:cstheme="minorHAnsi"/>
-          <w:sz w:val="22"/>
-          <w:szCs w:val="22"/>
-        </w:rPr>
-        <w:t>, providing more accurate and personalized calorie predictions.</w:t>
+        </w:rPr>
+        <w:t>Features:</w:t>
+      </w:r>
+    </w:p>
+    <w:p>
+      <w:pPr>
+        <w:pStyle w:val="ListParagraph"/>
+        <w:numPr>
+          <w:ilvl w:val="0"/>
+          <w:numId w:val="46"/>
+        </w:numPr>
+      </w:pPr>
+      <w:r>
+        <w:t>Age</w:t>
+      </w:r>
+    </w:p>
+    <w:p>
+      <w:pPr>
+        <w:pStyle w:val="ListParagraph"/>
+        <w:numPr>
+          <w:ilvl w:val="0"/>
+          <w:numId w:val="46"/>
+        </w:numPr>
+      </w:pPr>
+      <w:r>
+        <w:t>Height</w:t>
+      </w:r>
+    </w:p>
+    <w:p>
+      <w:pPr>
+        <w:pStyle w:val="ListParagraph"/>
+        <w:numPr>
+          <w:ilvl w:val="0"/>
+          <w:numId w:val="46"/>
+        </w:numPr>
+      </w:pPr>
+      <w:r>
+        <w:t>Weight</w:t>
+      </w:r>
+    </w:p>
+    <w:p>
+      <w:pPr>
+        <w:pStyle w:val="ListParagraph"/>
+        <w:numPr>
+          <w:ilvl w:val="0"/>
+          <w:numId w:val="46"/>
+        </w:numPr>
+      </w:pPr>
+      <w:r>
+        <w:t>BMI</w:t>
+      </w:r>
+    </w:p>
+    <w:p>
+      <w:pPr>
+        <w:pStyle w:val="ListParagraph"/>
+        <w:numPr>
+          <w:ilvl w:val="0"/>
+          <w:numId w:val="46"/>
+        </w:numPr>
+      </w:pPr>
+      <w:r>
+        <w:t>BMI Level (Underweight, Normal, Overweight, Obese)</w:t>
+      </w:r>
+    </w:p>
+    <w:p>
+      <w:pPr>
+        <w:pStyle w:val="ListParagraph"/>
+        <w:numPr>
+          <w:ilvl w:val="0"/>
+          <w:numId w:val="46"/>
+        </w:numPr>
+      </w:pPr>
+      <w:r>
+        <w:t>Hypertension (Yes/No)</w:t>
+      </w:r>
+    </w:p>
+    <w:p>
+      <w:pPr>
+        <w:pStyle w:val="ListParagraph"/>
+        <w:numPr>
+          <w:ilvl w:val="0"/>
+          <w:numId w:val="46"/>
+        </w:numPr>
+      </w:pPr>
+      <w:r>
+        <w:t>Diabetes (Yes/No)</w:t>
+      </w:r>
+    </w:p>
+    <w:p>
+      <w:pPr>
+        <w:pStyle w:val="ListParagraph"/>
+        <w:numPr>
+          <w:ilvl w:val="0"/>
+          <w:numId w:val="46"/>
+        </w:numPr>
+      </w:pPr>
+      <w:r>
+        <w:t>Fitness Goal (Weight Loss, Weight Gain, Muscle Gain)</w:t>
+      </w:r>
+    </w:p>
+    <w:p>
+      <w:pPr>
+        <w:pStyle w:val="ListParagraph"/>
+        <w:numPr>
+          <w:ilvl w:val="0"/>
+          <w:numId w:val="46"/>
+        </w:numPr>
+      </w:pPr>
+      <w:r>
+        <w:t>Fitness Type (Cardio, Muscular Fitness)</w:t>
+      </w:r>
+    </w:p>
+    <w:p>
+      <w:pPr>
+        <w:pStyle w:val="ListParagraph"/>
+        <w:numPr>
+          <w:ilvl w:val="0"/>
+          <w:numId w:val="46"/>
+        </w:numPr>
+      </w:pPr>
+      <w:r>
+        <w:t>Recommended Exercises</w:t>
+      </w:r>
+    </w:p>
+    <w:p>
+      <w:pPr>
+        <w:pStyle w:val="ListParagraph"/>
+        <w:numPr>
+          <w:ilvl w:val="0"/>
+          <w:numId w:val="46"/>
+        </w:numPr>
+      </w:pPr>
+      <w:r>
+        <w:t>Required Equipment</w:t>
+      </w:r>
+    </w:p>
+    <w:p>
+      <w:pPr>
+        <w:pStyle w:val="ListParagraph"/>
+        <w:numPr>
+          <w:ilvl w:val="0"/>
+          <w:numId w:val="46"/>
+        </w:numPr>
+      </w:pPr>
+      <w:r>
+        <w:t>Dietary Suggestions</w:t>
+      </w:r>
+    </w:p>
+    <w:p>
+      <w:pPr>
+        <w:pStyle w:val="ListParagraph"/>
+        <w:ind w:left="1440"/>
+        <w:rPr>
+          <w:b/>
+          <w:bCs/>
+        </w:rPr>
+      </w:pPr>
+      <w:r>
+        <w:rPr>
+          <w:b/>
+          <w:bCs/>
+        </w:rPr>
+        <w:t>Purpose: This peer</w:t>
+      </w:r>
+      <w:r>
+        <w:rPr>
+          <w:b/>
+          <w:bCs/>
+        </w:rPr>
+        <w:t xml:space="preserve"> </w:t>
+      </w:r>
+      <w:r>
+        <w:rPr>
+          <w:b/>
+          <w:bCs/>
+        </w:rPr>
+        <w:t>reviewed, research</w:t>
+      </w:r>
+      <w:r>
+        <w:rPr>
+          <w:b/>
+          <w:bCs/>
+        </w:rPr>
+        <w:t xml:space="preserve"> </w:t>
+      </w:r>
+      <w:r>
+        <w:rPr>
+          <w:b/>
+          <w:bCs/>
+        </w:rPr>
+        <w:t>published dataset directly powers the Adaptive AI Fitness Coach module. It maps user health profiles and fitness goals to personalized exercise plans, equipment requirements, and dietary guidance. Because it includes health condition flags such as Hypertension and Diabetes, the system can provide responsible, health</w:t>
+      </w:r>
+      <w:r>
+        <w:rPr>
+          <w:b/>
+          <w:bCs/>
+        </w:rPr>
+        <w:t xml:space="preserve"> </w:t>
+      </w:r>
+      <w:r>
+        <w:rPr>
+          <w:b/>
+          <w:bCs/>
+        </w:rPr>
+        <w:t>aware recommendations. This dataset is used as a recommendation lookup table matched against the user's profile after each workout session to generate the next coaching output.</w:t>
+      </w:r>
+    </w:p>
+    <w:p>
+      <w:pPr>
+        <w:pStyle w:val="ListParagraph"/>
+        <w:numPr>
+          <w:ilvl w:val="0"/>
+          <w:numId w:val="42"/>
+        </w:numPr>
+        <w:rPr>
+          <w:b/>
+          <w:bCs/>
+        </w:rPr>
+      </w:pPr>
+      <w:proofErr w:type="spellStart"/>
+      <w:r>
+        <w:rPr>
+          <w:b/>
+          <w:bCs/>
+        </w:rPr>
+        <w:t>OpenWeather</w:t>
+      </w:r>
+      <w:proofErr w:type="spellEnd"/>
+      <w:r>
+        <w:rPr>
+          <w:b/>
+          <w:bCs/>
+        </w:rPr>
+        <w:t xml:space="preserve"> API (Live Environmental Data)</w:t>
+      </w:r>
+    </w:p>
+    <w:p>
+      <w:pPr>
+        <w:pStyle w:val="ListParagraph"/>
+        <w:ind w:left="1080"/>
+        <w:rPr>
+          <w:i/>
+          <w:iCs/>
+        </w:rPr>
+      </w:pPr>
+      <w:r>
+        <w:rPr>
+          <w:b/>
+          <w:bCs/>
+        </w:rPr>
+        <w:t xml:space="preserve">Link: </w:t>
+      </w:r>
+      <w:r>
+        <w:rPr>
+          <w:i/>
+          <w:iCs/>
+        </w:rPr>
+        <w:t>openweathermap.org/</w:t>
+      </w:r>
+      <w:proofErr w:type="spellStart"/>
+      <w:r>
+        <w:rPr>
+          <w:i/>
+          <w:iCs/>
+        </w:rPr>
+        <w:t>api</w:t>
+      </w:r>
+      <w:proofErr w:type="spellEnd"/>
+    </w:p>
+    <w:p>
+      <w:pPr>
+        <w:pStyle w:val="ListParagraph"/>
+        <w:ind w:left="1080"/>
+        <w:rPr>
+          <w:b/>
+          <w:bCs/>
+        </w:rPr>
+      </w:pPr>
+      <w:r>
+        <w:rPr>
+          <w:b/>
+          <w:bCs/>
+        </w:rPr>
+        <w:t>Features:</w:t>
+      </w:r>
+    </w:p>
+    <w:p>
+      <w:pPr>
+        <w:pStyle w:val="ListParagraph"/>
+        <w:numPr>
+          <w:ilvl w:val="0"/>
+          <w:numId w:val="47"/>
+        </w:numPr>
+      </w:pPr>
+      <w:r>
+        <w:t>Temperature (°C)</w:t>
+      </w:r>
+    </w:p>
+    <w:p>
+      <w:pPr>
+        <w:pStyle w:val="ListParagraph"/>
+        <w:numPr>
+          <w:ilvl w:val="0"/>
+          <w:numId w:val="47"/>
+        </w:numPr>
+      </w:pPr>
+      <w:r>
+        <w:t>Humidity (%)</w:t>
+      </w:r>
+    </w:p>
+    <w:p>
+      <w:pPr>
+        <w:pStyle w:val="ListParagraph"/>
+        <w:numPr>
+          <w:ilvl w:val="0"/>
+          <w:numId w:val="47"/>
+        </w:numPr>
+      </w:pPr>
+      <w:r>
+        <w:lastRenderedPageBreak/>
+        <w:t>Wind Speed (m/s)</w:t>
+      </w:r>
+    </w:p>
+    <w:p>
+      <w:pPr>
+        <w:pStyle w:val="ListParagraph"/>
+        <w:numPr>
+          <w:ilvl w:val="0"/>
+          <w:numId w:val="47"/>
+        </w:numPr>
+      </w:pPr>
+      <w:r>
+        <w:t>Air Pressure (</w:t>
+      </w:r>
+      <w:proofErr w:type="spellStart"/>
+      <w:r>
+        <w:t>hPa</w:t>
+      </w:r>
+      <w:proofErr w:type="spellEnd"/>
+      <w:r>
+        <w:t>)</w:t>
+      </w:r>
+    </w:p>
+    <w:p>
+      <w:pPr>
+        <w:pStyle w:val="ListParagraph"/>
+        <w:numPr>
+          <w:ilvl w:val="0"/>
+          <w:numId w:val="47"/>
+        </w:numPr>
+        <w:rPr>
+          <w:b/>
+          <w:bCs/>
+        </w:rPr>
+      </w:pPr>
+      <w:r>
+        <w:t>Weather Condition (Clear, Rain, Cloudy, etc.)</w:t>
+      </w:r>
+    </w:p>
+    <w:p>
+      <w:pPr>
+        <w:pStyle w:val="ListParagraph"/>
+        <w:ind w:left="1080"/>
+        <w:rPr>
+          <w:b/>
+          <w:bCs/>
+          <w:i/>
+          <w:iCs/>
+        </w:rPr>
+      </w:pPr>
+      <w:r>
+        <w:rPr>
+          <w:b/>
+          <w:bCs/>
+        </w:rPr>
+        <w:t xml:space="preserve">Purpose: </w:t>
+      </w:r>
+      <w:r>
+        <w:t xml:space="preserve">Environmental factors such as temperature and humidity directly influence exercise intensity and calorie expenditure. The </w:t>
+      </w:r>
+      <w:proofErr w:type="spellStart"/>
+      <w:r>
+        <w:t>OpenWeather</w:t>
+      </w:r>
+      <w:proofErr w:type="spellEnd"/>
+      <w:r>
+        <w:t xml:space="preserve"> API is called at runtime within the web application to fetch the user's current environmental conditions based on their location. This live data is passed as additional input features to the trained prediction model, enabling truly real</w:t>
+      </w:r>
+      <w:r>
+        <w:t xml:space="preserve"> </w:t>
+      </w:r>
+      <w:r>
+        <w:t>time context</w:t>
+      </w:r>
+      <w:r>
+        <w:t xml:space="preserve"> </w:t>
+      </w:r>
+      <w:r>
+        <w:t>aware calorie estimation.</w:t>
       </w:r>
     </w:p>
     <w:p>
@@ -3862,7 +3159,25 @@
           <w:sz w:val="20"/>
           <w:szCs w:val="20"/>
         </w:rPr>
-        <w:t>The trained model will be integrated into a web application that allows users to enter workout details and receive predicted calorie expenditur</w:t>
+        <w:t xml:space="preserve">The trained model will be integrated into a web application that allows users to enter </w:t>
+      </w:r>
+      <w:proofErr w:type="spellStart"/>
+      <w:r>
+        <w:rPr>
+          <w:rFonts w:cstheme="minorHAnsi"/>
+          <w:sz w:val="20"/>
+          <w:szCs w:val="20"/>
+        </w:rPr>
+        <w:t>workout</w:t>
+      </w:r>
+      <w:proofErr w:type="spellEnd"/>
+      <w:r>
+        <w:rPr>
+          <w:rFonts w:cstheme="minorHAnsi"/>
+          <w:sz w:val="20"/>
+          <w:szCs w:val="20"/>
+        </w:rPr>
+        <w:t xml:space="preserve"> details and receive predicted calorie expenditur</w:t>
       </w:r>
       <w:r>
         <w:rPr>
@@ -4115,7 +3430,6 @@
           <w:sz w:val="22"/>
           <w:szCs w:val="22"/>
         </w:rPr>
-        <w:lastRenderedPageBreak/>
         <w:t>Several regression algorithms will be trained and compared to determine the best-performing model.</w:t>
       </w:r>
     </w:p>
@@ -4201,7 +3515,25 @@
           <w:sz w:val="22"/>
           <w:szCs w:val="22"/>
         </w:rPr>
-        <w:t>Gradient Boosting (XGBoost)</w:t>
+        <w:t>Gradient Boosting (</w:t>
+      </w:r>
+      <w:proofErr w:type="spellStart"/>
+      <w:r>
+        <w:rPr>
+          <w:rFonts w:cstheme="minorHAnsi"/>
+          <w:sz w:val="22"/>
+          <w:szCs w:val="22"/>
+        </w:rPr>
+        <w:t>XGBoost</w:t>
+      </w:r>
+      <w:proofErr w:type="spellEnd"/>
+      <w:r>
+        <w:rPr>
+          <w:rFonts w:cstheme="minorHAnsi"/>
+          <w:sz w:val="22"/>
+          <w:szCs w:val="22"/>
+        </w:rPr>
+        <w:t>)</w:t>
       </w:r>
     </w:p>
     <w:p>
@@ -4286,15 +3618,7 @@
           <w:sz w:val="22"/>
           <w:szCs w:val="22"/>
         </w:rPr>
-        <w:t>T</w:t>
-      </w:r>
-      <w:r>
-        <w:rPr>
-          <w:rFonts w:cstheme="minorHAnsi"/>
-          <w:sz w:val="22"/>
-          <w:szCs w:val="22"/>
-        </w:rPr>
-        <w:t>he performance of each model will be evaluated using standard regression metrics.</w:t>
+        <w:t>The performance of each model will be evaluated using standard regression metrics.</w:t>
       </w:r>
     </w:p>
     <w:p>
@@ -4335,6 +3659,7 @@
           <w:sz w:val="22"/>
           <w:szCs w:val="22"/>
         </w:rPr>
+        <w:lastRenderedPageBreak/>
         <w:t>Mean Absolute Error (MAE)</w:t>
       </w:r>
     </w:p>
@@ -4869,7 +4194,6 @@
           <w:sz w:val="22"/>
           <w:szCs w:val="22"/>
         </w:rPr>
-        <w:lastRenderedPageBreak/>
         <w:t>prediction display panel</w:t>
       </w:r>
     </w:p>
@@ -5065,6 +4389,7 @@
           <w:sz w:val="22"/>
           <w:szCs w:val="22"/>
         </w:rPr>
+        <w:lastRenderedPageBreak/>
         <w:t>The architecture ensures efficient communication between the machine learning model and the user interface.</w:t>
       </w:r>
     </w:p>
@@ -5607,7 +4932,6 @@
           <w:sz w:val="28"/>
           <w:szCs w:val="28"/>
         </w:rPr>
-        <w:lastRenderedPageBreak/>
         <w:t xml:space="preserve"> Deliverable</w:t>
       </w:r>
     </w:p>
@@ -5790,6 +5114,7 @@
           <w:sz w:val="22"/>
           <w:szCs w:val="22"/>
         </w:rPr>
+        <w:lastRenderedPageBreak/>
         <w:t>Therefore, predictions produced by the system should be interpreted as approximate estimates rather than exact measurements.</w:t>
       </w:r>
     </w:p>
@@ -6107,7 +5432,25 @@
           <w:sz w:val="22"/>
           <w:szCs w:val="22"/>
         </w:rPr>
-        <w:t>Bhuiyan, M. S., Likhon, M. N. H., Habib, A. A., Fahim, M. A., &amp; Apurba, A. Z. (2024). Revolutionizing Workout Analytics: Machine Learning Models for Calorie Burn Estimation.</w:t>
+        <w:t xml:space="preserve">Bhuiyan, M. S., </w:t>
+      </w:r>
+      <w:proofErr w:type="spellStart"/>
+      <w:r>
+        <w:rPr>
+          <w:rFonts w:asciiTheme="minorHAnsi" w:hAnsiTheme="minorHAnsi" w:cstheme="minorHAnsi"/>
+          <w:sz w:val="22"/>
+          <w:szCs w:val="22"/>
+        </w:rPr>
+        <w:t>Likhon</w:t>
+      </w:r>
+      <w:proofErr w:type="spellEnd"/>
+      <w:r>
+        <w:rPr>
+          <w:rFonts w:asciiTheme="minorHAnsi" w:hAnsiTheme="minorHAnsi" w:cstheme="minorHAnsi"/>
+          <w:sz w:val="22"/>
+          <w:szCs w:val="22"/>
+        </w:rPr>
+        <w:t>, M. N. H., Habib, A. A., Fahim, M. A., &amp; Apurba, A. Z. (2024). Revolutionizing Workout Analytics: Machine Learning Models for Calorie Burn Estimation.</w:t>
       </w:r>
     </w:p>
     <w:p>
@@ -6123,13 +5466,23 @@
           <w:szCs w:val="22"/>
         </w:rPr>
       </w:pPr>
+      <w:proofErr w:type="spellStart"/>
       <w:r>
         <w:rPr>
           <w:rFonts w:asciiTheme="minorHAnsi" w:hAnsiTheme="minorHAnsi" w:cstheme="minorHAnsi"/>
           <w:sz w:val="22"/>
           <w:szCs w:val="22"/>
         </w:rPr>
-        <w:t>Challagundla, Y., Narayanan, B., Devatha, K., Bharathi, V., &amp; Vardhaman, J. (2024). A Multi-Model Machine Learning Approach for Monitoring Calories Being Burnt During Workouts Using Smart Calorie Tracer.</w:t>
+        <w:t>Challagundla</w:t>
+      </w:r>
+      <w:proofErr w:type="spellEnd"/>
+      <w:r>
+        <w:rPr>
+          <w:rFonts w:asciiTheme="minorHAnsi" w:hAnsiTheme="minorHAnsi" w:cstheme="minorHAnsi"/>
+          <w:sz w:val="22"/>
+          <w:szCs w:val="22"/>
+        </w:rPr>
+        <w:t>, Y., Narayanan, B., Devatha, K., Bharathi, V., &amp; Vardhaman, J. (2024). A Multi-Model Machine Learning Approach for Monitoring Calories Being Burnt During Workouts Using Smart Calorie Tracer.</w:t>
       </w:r>
     </w:p>
     <w:p>
@@ -6151,7 +5504,43 @@
           <w:sz w:val="22"/>
           <w:szCs w:val="22"/>
         </w:rPr>
-        <w:t>Chen, T., &amp; Guestrin, C. (2016). XGBoost: A Scalable Tree Boosting System.</w:t>
+        <w:t xml:space="preserve">Chen, T., &amp; </w:t>
+      </w:r>
+      <w:proofErr w:type="spellStart"/>
+      <w:r>
+        <w:rPr>
+          <w:rFonts w:asciiTheme="minorHAnsi" w:hAnsiTheme="minorHAnsi" w:cstheme="minorHAnsi"/>
+          <w:sz w:val="22"/>
+          <w:szCs w:val="22"/>
+        </w:rPr>
+        <w:t>Guestrin</w:t>
+      </w:r>
+      <w:proofErr w:type="spellEnd"/>
+      <w:r>
+        <w:rPr>
+          <w:rFonts w:asciiTheme="minorHAnsi" w:hAnsiTheme="minorHAnsi" w:cstheme="minorHAnsi"/>
+          <w:sz w:val="22"/>
+          <w:szCs w:val="22"/>
+        </w:rPr>
+        <w:t xml:space="preserve">, C. (2016). </w:t>
+      </w:r>
+      <w:proofErr w:type="spellStart"/>
+      <w:r>
+        <w:rPr>
+          <w:rFonts w:asciiTheme="minorHAnsi" w:hAnsiTheme="minorHAnsi" w:cstheme="minorHAnsi"/>
+          <w:sz w:val="22"/>
+          <w:szCs w:val="22"/>
+        </w:rPr>
+        <w:t>XGBoost</w:t>
+      </w:r>
+      <w:proofErr w:type="spellEnd"/>
+      <w:r>
+        <w:rPr>
+          <w:rFonts w:asciiTheme="minorHAnsi" w:hAnsiTheme="minorHAnsi" w:cstheme="minorHAnsi"/>
+          <w:sz w:val="22"/>
+          <w:szCs w:val="22"/>
+        </w:rPr>
+        <w:t>: A Scalable Tree Boosting System.</w:t>
       </w:r>
     </w:p>
     <w:p>
@@ -6167,13 +5556,23 @@
           <w:szCs w:val="22"/>
         </w:rPr>
       </w:pPr>
+      <w:proofErr w:type="spellStart"/>
       <w:r>
         <w:rPr>
           <w:rFonts w:asciiTheme="minorHAnsi" w:hAnsiTheme="minorHAnsi" w:cstheme="minorHAnsi"/>
           <w:sz w:val="22"/>
           <w:szCs w:val="22"/>
         </w:rPr>
-        <w:t>Parhamfarjam. (2023). Calories Burnt Prediction Dataset. Kaggle.</w:t>
+        <w:t>Parhamfarjam</w:t>
+      </w:r>
+      <w:proofErr w:type="spellEnd"/>
+      <w:r>
+        <w:rPr>
+          <w:rFonts w:asciiTheme="minorHAnsi" w:hAnsiTheme="minorHAnsi" w:cstheme="minorHAnsi"/>
+          <w:sz w:val="22"/>
+          <w:szCs w:val="22"/>
+        </w:rPr>
+        <w:t>. (2023). Calories Burnt Prediction Dataset. Kaggle.</w:t>
       </w:r>
     </w:p>
     <w:p>
@@ -6217,8 +5616,25 @@
           <w:sz w:val="22"/>
           <w:szCs w:val="22"/>
         </w:rPr>
-        <w:lastRenderedPageBreak/>
-        <w:t>Tan, A. J. S., Embi, Z. C., &amp; Hashim, N. (2024). Comparison of Machine Learning Methods for Calories Burn Prediction.</w:t>
+        <w:t xml:space="preserve">Tan, A. J. S., </w:t>
+      </w:r>
+      <w:proofErr w:type="spellStart"/>
+      <w:r>
+        <w:rPr>
+          <w:rFonts w:asciiTheme="minorHAnsi" w:hAnsiTheme="minorHAnsi" w:cstheme="minorHAnsi"/>
+          <w:sz w:val="22"/>
+          <w:szCs w:val="22"/>
+        </w:rPr>
+        <w:t>Embi</w:t>
+      </w:r>
+      <w:proofErr w:type="spellEnd"/>
+      <w:r>
+        <w:rPr>
+          <w:rFonts w:asciiTheme="minorHAnsi" w:hAnsiTheme="minorHAnsi" w:cstheme="minorHAnsi"/>
+          <w:sz w:val="22"/>
+          <w:szCs w:val="22"/>
+        </w:rPr>
+        <w:t>, Z. C., &amp; Hashim, N. (2024). Comparison of Machine Learning Methods for Calories Burn Prediction.</w:t>
       </w:r>
     </w:p>
     <w:p>
@@ -6351,7 +5767,25 @@
                 <w:sz w:val="22"/>
                 <w:szCs w:val="22"/>
               </w:rPr>
-              <w:t>C.A Aneek Ahamed</w:t>
+              <w:t>C.</w:t>
+            </w:r>
+            <w:proofErr w:type="gramStart"/>
+            <w:r>
+              <w:rPr>
+                <w:rFonts w:asciiTheme="minorHAnsi" w:hAnsiTheme="minorHAnsi" w:cstheme="minorHAnsi"/>
+                <w:sz w:val="22"/>
+                <w:szCs w:val="22"/>
+              </w:rPr>
+              <w:t>A</w:t>
+            </w:r>
+            <w:proofErr w:type="gramEnd"/>
+            <w:r>
+              <w:rPr>
+                <w:rFonts w:asciiTheme="minorHAnsi" w:hAnsiTheme="minorHAnsi" w:cstheme="minorHAnsi"/>
+                <w:sz w:val="22"/>
+                <w:szCs w:val="22"/>
+              </w:rPr>
+              <w:t xml:space="preserve"> Aneek Ahamed</w:t>
             </w:r>
           </w:p>
         </w:tc>
@@ -6399,7 +5833,25 @@
                 <w:sz w:val="22"/>
                 <w:szCs w:val="22"/>
               </w:rPr>
-              <w:t>M.K Imadh Ahamed</w:t>
+              <w:t xml:space="preserve">M.K </w:t>
+            </w:r>
+            <w:proofErr w:type="spellStart"/>
+            <w:r>
+              <w:rPr>
+                <w:rFonts w:asciiTheme="minorHAnsi" w:hAnsiTheme="minorHAnsi" w:cstheme="minorHAnsi"/>
+                <w:sz w:val="22"/>
+                <w:szCs w:val="22"/>
+              </w:rPr>
+              <w:t>Imadh</w:t>
+            </w:r>
+            <w:proofErr w:type="spellEnd"/>
+            <w:r>
+              <w:rPr>
+                <w:rFonts w:asciiTheme="minorHAnsi" w:hAnsiTheme="minorHAnsi" w:cstheme="minorHAnsi"/>
+                <w:sz w:val="22"/>
+                <w:szCs w:val="22"/>
+              </w:rPr>
+              <w:t xml:space="preserve"> Ahamed</w:t>
             </w:r>
           </w:p>
         </w:tc>
@@ -6422,15 +5874,7 @@
                 <w:sz w:val="22"/>
                 <w:szCs w:val="22"/>
               </w:rPr>
-              <w:t>KIC-HNDCSAI-252F-0</w:t>
-            </w:r>
-            <w:r>
-              <w:rPr>
-                <w:rFonts w:asciiTheme="minorHAnsi" w:hAnsiTheme="minorHAnsi" w:cstheme="minorHAnsi"/>
-                <w:sz w:val="22"/>
-                <w:szCs w:val="22"/>
-              </w:rPr>
-              <w:t>32</w:t>
+              <w:t>KIC-HNDCSAI-252F-032</w:t>
             </w:r>
           </w:p>
         </w:tc>
@@ -6449,14 +5893,26 @@
                 <w:szCs w:val="22"/>
               </w:rPr>
             </w:pPr>
+            <w:proofErr w:type="spellStart"/>
             <w:r>
               <w:rPr>
                 <w:rFonts w:asciiTheme="minorHAnsi" w:hAnsiTheme="minorHAnsi" w:cstheme="minorHAnsi"/>
                 <w:sz w:val="22"/>
                 <w:szCs w:val="22"/>
               </w:rPr>
-              <w:t>M.H.Nasrullah</w:t>
+              <w:t>M.</w:t>
             </w:r>
+            <w:proofErr w:type="gramStart"/>
+            <w:r>
+              <w:rPr>
+                <w:rFonts w:asciiTheme="minorHAnsi" w:hAnsiTheme="minorHAnsi" w:cstheme="minorHAnsi"/>
+                <w:sz w:val="22"/>
+                <w:szCs w:val="22"/>
+              </w:rPr>
+              <w:t>H.Nasrullah</w:t>
+            </w:r>
+            <w:proofErr w:type="spellEnd"/>
+            <w:proofErr w:type="gramEnd"/>
           </w:p>
         </w:tc>
         <w:tc>
@@ -6478,15 +5934,7 @@
                 <w:sz w:val="22"/>
                 <w:szCs w:val="22"/>
               </w:rPr>
-              <w:t>KIC-HNDCSAI-252F-03</w:t>
-            </w:r>
-            <w:r>
-              <w:rPr>
-                <w:rFonts w:asciiTheme="minorHAnsi" w:hAnsiTheme="minorHAnsi" w:cstheme="minorHAnsi"/>
-                <w:sz w:val="22"/>
-                <w:szCs w:val="22"/>
-              </w:rPr>
-              <w:t>1</w:t>
+              <w:t>KIC-HNDCSAI-252F-031</w:t>
             </w:r>
           </w:p>
         </w:tc>
@@ -6534,15 +5982,7 @@
                 <w:sz w:val="22"/>
                 <w:szCs w:val="22"/>
               </w:rPr>
-              <w:t>KIC-HNDCSAI-252F-03</w:t>
-            </w:r>
-            <w:r>
-              <w:rPr>
-                <w:rFonts w:asciiTheme="minorHAnsi" w:hAnsiTheme="minorHAnsi" w:cstheme="minorHAnsi"/>
-                <w:sz w:val="22"/>
-                <w:szCs w:val="22"/>
-              </w:rPr>
-              <w:t>9</w:t>
+              <w:t>KIC-HNDCSAI-252F-039</w:t>
             </w:r>
           </w:p>
         </w:tc>
@@ -6590,15 +6030,7 @@
                 <w:sz w:val="22"/>
                 <w:szCs w:val="22"/>
               </w:rPr>
-              <w:t>KIC-HNDCSAI-252F-0</w:t>
-            </w:r>
-            <w:r>
-              <w:rPr>
-                <w:rFonts w:asciiTheme="minorHAnsi" w:hAnsiTheme="minorHAnsi" w:cstheme="minorHAnsi"/>
-                <w:sz w:val="22"/>
-                <w:szCs w:val="22"/>
-              </w:rPr>
-              <w:t>03</w:t>
+              <w:t>KIC-HNDCSAI-252F-003</w:t>
             </w:r>
           </w:p>
         </w:tc>
@@ -9699,6 +9131,155 @@
     </w:lvl>
   </w:abstractNum>
   <w:abstractNum w:abstractNumId="24" w15:restartNumberingAfterBreak="0">
+    <w:nsid w:val="4E7362E2"/>
+    <w:multiLevelType w:val="multilevel"/>
+    <w:tmpl w:val="88A45DFC"/>
+    <w:lvl w:ilvl="0">
+      <w:start w:val="1"/>
+      <w:numFmt w:val="bullet"/>
+      <w:lvlText w:val=""/>
+      <w:lvlJc w:val="left"/>
+      <w:pPr>
+        <w:tabs>
+          <w:tab w:val="num" w:pos="2160"/>
+        </w:tabs>
+        <w:ind w:left="2160" w:hanging="360"/>
+      </w:pPr>
+      <w:rPr>
+        <w:rFonts w:ascii="Symbol" w:hAnsi="Symbol" w:hint="default"/>
+        <w:sz w:val="20"/>
+      </w:rPr>
+    </w:lvl>
+    <w:lvl w:ilvl="1" w:tentative="1">
+      <w:start w:val="1"/>
+      <w:numFmt w:val="bullet"/>
+      <w:lvlText w:val="o"/>
+      <w:lvlJc w:val="left"/>
+      <w:pPr>
+        <w:tabs>
+          <w:tab w:val="num" w:pos="2880"/>
+        </w:tabs>
+        <w:ind w:left="2880" w:hanging="360"/>
+      </w:pPr>
+      <w:rPr>
+        <w:rFonts w:ascii="Courier New" w:hAnsi="Courier New" w:hint="default"/>
+        <w:sz w:val="20"/>
+      </w:rPr>
+    </w:lvl>
+    <w:lvl w:ilvl="2" w:tentative="1">
+      <w:start w:val="1"/>
+      <w:numFmt w:val="bullet"/>
+      <w:lvlText w:val=""/>
+      <w:lvlJc w:val="left"/>
+      <w:pPr>
+        <w:tabs>
+          <w:tab w:val="num" w:pos="3600"/>
+        </w:tabs>
+        <w:ind w:left="3600" w:hanging="360"/>
+      </w:pPr>
+      <w:rPr>
+        <w:rFonts w:ascii="Wingdings" w:hAnsi="Wingdings" w:hint="default"/>
+        <w:sz w:val="20"/>
+      </w:rPr>
+    </w:lvl>
+    <w:lvl w:ilvl="3" w:tentative="1">
+      <w:start w:val="1"/>
+      <w:numFmt w:val="bullet"/>
+      <w:lvlText w:val=""/>
+      <w:lvlJc w:val="left"/>
+      <w:pPr>
+        <w:tabs>
+          <w:tab w:val="num" w:pos="4320"/>
+        </w:tabs>
+        <w:ind w:left="4320" w:hanging="360"/>
+      </w:pPr>
+      <w:rPr>
+        <w:rFonts w:ascii="Wingdings" w:hAnsi="Wingdings" w:hint="default"/>
+        <w:sz w:val="20"/>
+      </w:rPr>
+    </w:lvl>
+    <w:lvl w:ilvl="4" w:tentative="1">
+      <w:start w:val="1"/>
+      <w:numFmt w:val="bullet"/>
+      <w:lvlText w:val=""/>
+      <w:lvlJc w:val="left"/>
+      <w:pPr>
+        <w:tabs>
+          <w:tab w:val="num" w:pos="5040"/>
+        </w:tabs>
+        <w:ind w:left="5040" w:hanging="360"/>
+      </w:pPr>
+      <w:rPr>
+        <w:rFonts w:ascii="Wingdings" w:hAnsi="Wingdings" w:hint="default"/>
+        <w:sz w:val="20"/>
+      </w:rPr>
+    </w:lvl>
+    <w:lvl w:ilvl="5" w:tentative="1">
+      <w:start w:val="1"/>
+      <w:numFmt w:val="bullet"/>
+      <w:lvlText w:val=""/>
+      <w:lvlJc w:val="left"/>
+      <w:pPr>
+        <w:tabs>
+          <w:tab w:val="num" w:pos="5760"/>
+        </w:tabs>
+        <w:ind w:left="5760" w:hanging="360"/>
+      </w:pPr>
+      <w:rPr>
+        <w:rFonts w:ascii="Wingdings" w:hAnsi="Wingdings" w:hint="default"/>
+        <w:sz w:val="20"/>
+      </w:rPr>
+    </w:lvl>
+    <w:lvl w:ilvl="6" w:tentative="1">
+      <w:start w:val="1"/>
+      <w:numFmt w:val="bullet"/>
+      <w:lvlText w:val=""/>
+      <w:lvlJc w:val="left"/>
+      <w:pPr>
+        <w:tabs>
+          <w:tab w:val="num" w:pos="6480"/>
+        </w:tabs>
+        <w:ind w:left="6480" w:hanging="360"/>
+      </w:pPr>
+      <w:rPr>
+        <w:rFonts w:ascii="Wingdings" w:hAnsi="Wingdings" w:hint="default"/>
+        <w:sz w:val="20"/>
+      </w:rPr>
+    </w:lvl>
+    <w:lvl w:ilvl="7" w:tentative="1">
+      <w:start w:val="1"/>
+      <w:numFmt w:val="bullet"/>
+      <w:lvlText w:val=""/>
+      <w:lvlJc w:val="left"/>
+      <w:pPr>
+        <w:tabs>
+          <w:tab w:val="num" w:pos="7200"/>
+        </w:tabs>
+        <w:ind w:left="7200" w:hanging="360"/>
+      </w:pPr>
+      <w:rPr>
+        <w:rFonts w:ascii="Wingdings" w:hAnsi="Wingdings" w:hint="default"/>
+        <w:sz w:val="20"/>
+      </w:rPr>
+    </w:lvl>
+    <w:lvl w:ilvl="8" w:tentative="1">
+      <w:start w:val="1"/>
+      <w:numFmt w:val="bullet"/>
+      <w:lvlText w:val=""/>
+      <w:lvlJc w:val="left"/>
+      <w:pPr>
+        <w:tabs>
+          <w:tab w:val="num" w:pos="7920"/>
+        </w:tabs>
+        <w:ind w:left="7920" w:hanging="360"/>
+      </w:pPr>
+      <w:rPr>
+        <w:rFonts w:ascii="Wingdings" w:hAnsi="Wingdings" w:hint="default"/>
+        <w:sz w:val="20"/>
+      </w:rPr>
+    </w:lvl>
+  </w:abstractNum>
+  <w:abstractNum w:abstractNumId="25" w15:restartNumberingAfterBreak="0">
     <w:nsid w:val="50115AC9"/>
     <w:multiLevelType w:val="hybridMultilevel"/>
     <w:tmpl w:val="17929E4A"/>
@@ -9810,7 +9391,7 @@
       </w:rPr>
     </w:lvl>
   </w:abstractNum>
-  <w:abstractNum w:abstractNumId="25" w15:restartNumberingAfterBreak="0">
+  <w:abstractNum w:abstractNumId="26" w15:restartNumberingAfterBreak="0">
     <w:nsid w:val="57D37080"/>
     <w:multiLevelType w:val="multilevel"/>
     <w:tmpl w:val="790C3442"/>
@@ -9955,7 +9536,7 @@
       </w:rPr>
     </w:lvl>
   </w:abstractNum>
-  <w:abstractNum w:abstractNumId="26" w15:restartNumberingAfterBreak="0">
+  <w:abstractNum w:abstractNumId="27" w15:restartNumberingAfterBreak="0">
     <w:nsid w:val="5D264002"/>
     <w:multiLevelType w:val="hybridMultilevel"/>
     <w:tmpl w:val="4D5C2FBA"/>
@@ -10067,7 +9648,156 @@
       </w:rPr>
     </w:lvl>
   </w:abstractNum>
-  <w:abstractNum w:abstractNumId="27" w15:restartNumberingAfterBreak="0">
+  <w:abstractNum w:abstractNumId="28" w15:restartNumberingAfterBreak="0">
+    <w:nsid w:val="5E745826"/>
+    <w:multiLevelType w:val="multilevel"/>
+    <w:tmpl w:val="D8E0C6C2"/>
+    <w:lvl w:ilvl="0">
+      <w:start w:val="1"/>
+      <w:numFmt w:val="bullet"/>
+      <w:lvlText w:val=""/>
+      <w:lvlJc w:val="left"/>
+      <w:pPr>
+        <w:tabs>
+          <w:tab w:val="num" w:pos="2160"/>
+        </w:tabs>
+        <w:ind w:left="2160" w:hanging="360"/>
+      </w:pPr>
+      <w:rPr>
+        <w:rFonts w:ascii="Symbol" w:hAnsi="Symbol" w:hint="default"/>
+        <w:sz w:val="20"/>
+      </w:rPr>
+    </w:lvl>
+    <w:lvl w:ilvl="1" w:tentative="1">
+      <w:start w:val="1"/>
+      <w:numFmt w:val="bullet"/>
+      <w:lvlText w:val="o"/>
+      <w:lvlJc w:val="left"/>
+      <w:pPr>
+        <w:tabs>
+          <w:tab w:val="num" w:pos="2880"/>
+        </w:tabs>
+        <w:ind w:left="2880" w:hanging="360"/>
+      </w:pPr>
+      <w:rPr>
+        <w:rFonts w:ascii="Courier New" w:hAnsi="Courier New" w:hint="default"/>
+        <w:sz w:val="20"/>
+      </w:rPr>
+    </w:lvl>
+    <w:lvl w:ilvl="2" w:tentative="1">
+      <w:start w:val="1"/>
+      <w:numFmt w:val="bullet"/>
+      <w:lvlText w:val=""/>
+      <w:lvlJc w:val="left"/>
+      <w:pPr>
+        <w:tabs>
+          <w:tab w:val="num" w:pos="3600"/>
+        </w:tabs>
+        <w:ind w:left="3600" w:hanging="360"/>
+      </w:pPr>
+      <w:rPr>
+        <w:rFonts w:ascii="Wingdings" w:hAnsi="Wingdings" w:hint="default"/>
+        <w:sz w:val="20"/>
+      </w:rPr>
+    </w:lvl>
+    <w:lvl w:ilvl="3" w:tentative="1">
+      <w:start w:val="1"/>
+      <w:numFmt w:val="bullet"/>
+      <w:lvlText w:val=""/>
+      <w:lvlJc w:val="left"/>
+      <w:pPr>
+        <w:tabs>
+          <w:tab w:val="num" w:pos="4320"/>
+        </w:tabs>
+        <w:ind w:left="4320" w:hanging="360"/>
+      </w:pPr>
+      <w:rPr>
+        <w:rFonts w:ascii="Wingdings" w:hAnsi="Wingdings" w:hint="default"/>
+        <w:sz w:val="20"/>
+      </w:rPr>
+    </w:lvl>
+    <w:lvl w:ilvl="4" w:tentative="1">
+      <w:start w:val="1"/>
+      <w:numFmt w:val="bullet"/>
+      <w:lvlText w:val=""/>
+      <w:lvlJc w:val="left"/>
+      <w:pPr>
+        <w:tabs>
+          <w:tab w:val="num" w:pos="5040"/>
+        </w:tabs>
+        <w:ind w:left="5040" w:hanging="360"/>
+      </w:pPr>
+      <w:rPr>
+        <w:rFonts w:ascii="Wingdings" w:hAnsi="Wingdings" w:hint="default"/>
+        <w:sz w:val="20"/>
+      </w:rPr>
+    </w:lvl>
+    <w:lvl w:ilvl="5" w:tentative="1">
+      <w:start w:val="1"/>
+      <w:numFmt w:val="bullet"/>
+      <w:lvlText w:val=""/>
+      <w:lvlJc w:val="left"/>
+      <w:pPr>
+        <w:tabs>
+          <w:tab w:val="num" w:pos="5760"/>
+        </w:tabs>
+        <w:ind w:left="5760" w:hanging="360"/>
+      </w:pPr>
+      <w:rPr>
+        <w:rFonts w:ascii="Wingdings" w:hAnsi="Wingdings" w:hint="default"/>
+        <w:sz w:val="20"/>
+      </w:rPr>
+    </w:lvl>
+    <w:lvl w:ilvl="6" w:tentative="1">
+      <w:start w:val="1"/>
+      <w:numFmt w:val="bullet"/>
+      <w:lvlText w:val=""/>
+      <w:lvlJc w:val="left"/>
+      <w:pPr>
+        <w:tabs>
+          <w:tab w:val="num" w:pos="6480"/>
+        </w:tabs>
+        <w:ind w:left="6480" w:hanging="360"/>
+      </w:pPr>
+      <w:rPr>
+        <w:rFonts w:ascii="Wingdings" w:hAnsi="Wingdings" w:hint="default"/>
+        <w:sz w:val="20"/>
+      </w:rPr>
+    </w:lvl>
+    <w:lvl w:ilvl="7" w:tentative="1">
+      <w:start w:val="1"/>
+      <w:numFmt w:val="bullet"/>
+      <w:lvlText w:val=""/>
+      <w:lvlJc w:val="left"/>
+      <w:pPr>
+        <w:tabs>
+          <w:tab w:val="num" w:pos="7200"/>
+        </w:tabs>
+        <w:ind w:left="7200" w:hanging="360"/>
+      </w:pPr>
+      <w:rPr>
+        <w:rFonts w:ascii="Wingdings" w:hAnsi="Wingdings" w:hint="default"/>
+        <w:sz w:val="20"/>
+      </w:rPr>
+    </w:lvl>
+    <w:lvl w:ilvl="8" w:tentative="1">
+      <w:start w:val="1"/>
+      <w:numFmt w:val="bullet"/>
+      <w:lvlText w:val=""/>
+      <w:lvlJc w:val="left"/>
+      <w:pPr>
+        <w:tabs>
+          <w:tab w:val="num" w:pos="7920"/>
+        </w:tabs>
+        <w:ind w:left="7920" w:hanging="360"/>
+      </w:pPr>
+      <w:rPr>
+        <w:rFonts w:ascii="Wingdings" w:hAnsi="Wingdings" w:hint="default"/>
+        <w:sz w:val="20"/>
+      </w:rPr>
+    </w:lvl>
+  </w:abstractNum>
+  <w:abstractNum w:abstractNumId="29" w15:restartNumberingAfterBreak="0">
     <w:nsid w:val="63BD0B42"/>
     <w:multiLevelType w:val="multilevel"/>
     <w:tmpl w:val="2B6C2E92"/>
@@ -10180,7 +9910,156 @@
       </w:pPr>
     </w:lvl>
   </w:abstractNum>
-  <w:abstractNum w:abstractNumId="28" w15:restartNumberingAfterBreak="0">
+  <w:abstractNum w:abstractNumId="30" w15:restartNumberingAfterBreak="0">
+    <w:nsid w:val="640E3264"/>
+    <w:multiLevelType w:val="multilevel"/>
+    <w:tmpl w:val="BCC66E94"/>
+    <w:lvl w:ilvl="0">
+      <w:start w:val="1"/>
+      <w:numFmt w:val="bullet"/>
+      <w:lvlText w:val=""/>
+      <w:lvlJc w:val="left"/>
+      <w:pPr>
+        <w:tabs>
+          <w:tab w:val="num" w:pos="1800"/>
+        </w:tabs>
+        <w:ind w:left="1800" w:hanging="360"/>
+      </w:pPr>
+      <w:rPr>
+        <w:rFonts w:ascii="Symbol" w:hAnsi="Symbol" w:hint="default"/>
+        <w:sz w:val="20"/>
+      </w:rPr>
+    </w:lvl>
+    <w:lvl w:ilvl="1" w:tentative="1">
+      <w:start w:val="1"/>
+      <w:numFmt w:val="bullet"/>
+      <w:lvlText w:val="o"/>
+      <w:lvlJc w:val="left"/>
+      <w:pPr>
+        <w:tabs>
+          <w:tab w:val="num" w:pos="2520"/>
+        </w:tabs>
+        <w:ind w:left="2520" w:hanging="360"/>
+      </w:pPr>
+      <w:rPr>
+        <w:rFonts w:ascii="Courier New" w:hAnsi="Courier New" w:hint="default"/>
+        <w:sz w:val="20"/>
+      </w:rPr>
+    </w:lvl>
+    <w:lvl w:ilvl="2" w:tentative="1">
+      <w:start w:val="1"/>
+      <w:numFmt w:val="bullet"/>
+      <w:lvlText w:val=""/>
+      <w:lvlJc w:val="left"/>
+      <w:pPr>
+        <w:tabs>
+          <w:tab w:val="num" w:pos="3240"/>
+        </w:tabs>
+        <w:ind w:left="3240" w:hanging="360"/>
+      </w:pPr>
+      <w:rPr>
+        <w:rFonts w:ascii="Wingdings" w:hAnsi="Wingdings" w:hint="default"/>
+        <w:sz w:val="20"/>
+      </w:rPr>
+    </w:lvl>
+    <w:lvl w:ilvl="3" w:tentative="1">
+      <w:start w:val="1"/>
+      <w:numFmt w:val="bullet"/>
+      <w:lvlText w:val=""/>
+      <w:lvlJc w:val="left"/>
+      <w:pPr>
+        <w:tabs>
+          <w:tab w:val="num" w:pos="3960"/>
+        </w:tabs>
+        <w:ind w:left="3960" w:hanging="360"/>
+      </w:pPr>
+      <w:rPr>
+        <w:rFonts w:ascii="Wingdings" w:hAnsi="Wingdings" w:hint="default"/>
+        <w:sz w:val="20"/>
+      </w:rPr>
+    </w:lvl>
+    <w:lvl w:ilvl="4" w:tentative="1">
+      <w:start w:val="1"/>
+      <w:numFmt w:val="bullet"/>
+      <w:lvlText w:val=""/>
+      <w:lvlJc w:val="left"/>
+      <w:pPr>
+        <w:tabs>
+          <w:tab w:val="num" w:pos="4680"/>
+        </w:tabs>
+        <w:ind w:left="4680" w:hanging="360"/>
+      </w:pPr>
+      <w:rPr>
+        <w:rFonts w:ascii="Wingdings" w:hAnsi="Wingdings" w:hint="default"/>
+        <w:sz w:val="20"/>
+      </w:rPr>
+    </w:lvl>
+    <w:lvl w:ilvl="5" w:tentative="1">
+      <w:start w:val="1"/>
+      <w:numFmt w:val="bullet"/>
+      <w:lvlText w:val=""/>
+      <w:lvlJc w:val="left"/>
+      <w:pPr>
+        <w:tabs>
+          <w:tab w:val="num" w:pos="5400"/>
+        </w:tabs>
+        <w:ind w:left="5400" w:hanging="360"/>
+      </w:pPr>
+      <w:rPr>
+        <w:rFonts w:ascii="Wingdings" w:hAnsi="Wingdings" w:hint="default"/>
+        <w:sz w:val="20"/>
+      </w:rPr>
+    </w:lvl>
+    <w:lvl w:ilvl="6" w:tentative="1">
+      <w:start w:val="1"/>
+      <w:numFmt w:val="bullet"/>
+      <w:lvlText w:val=""/>
+      <w:lvlJc w:val="left"/>
+      <w:pPr>
+        <w:tabs>
+          <w:tab w:val="num" w:pos="6120"/>
+        </w:tabs>
+        <w:ind w:left="6120" w:hanging="360"/>
+      </w:pPr>
+      <w:rPr>
+        <w:rFonts w:ascii="Wingdings" w:hAnsi="Wingdings" w:hint="default"/>
+        <w:sz w:val="20"/>
+      </w:rPr>
+    </w:lvl>
+    <w:lvl w:ilvl="7" w:tentative="1">
+      <w:start w:val="1"/>
+      <w:numFmt w:val="bullet"/>
+      <w:lvlText w:val=""/>
+      <w:lvlJc w:val="left"/>
+      <w:pPr>
+        <w:tabs>
+          <w:tab w:val="num" w:pos="6840"/>
+        </w:tabs>
+        <w:ind w:left="6840" w:hanging="360"/>
+      </w:pPr>
+      <w:rPr>
+        <w:rFonts w:ascii="Wingdings" w:hAnsi="Wingdings" w:hint="default"/>
+        <w:sz w:val="20"/>
+      </w:rPr>
+    </w:lvl>
+    <w:lvl w:ilvl="8" w:tentative="1">
+      <w:start w:val="1"/>
+      <w:numFmt w:val="bullet"/>
+      <w:lvlText w:val=""/>
+      <w:lvlJc w:val="left"/>
+      <w:pPr>
+        <w:tabs>
+          <w:tab w:val="num" w:pos="7560"/>
+        </w:tabs>
+        <w:ind w:left="7560" w:hanging="360"/>
+      </w:pPr>
+      <w:rPr>
+        <w:rFonts w:ascii="Wingdings" w:hAnsi="Wingdings" w:hint="default"/>
+        <w:sz w:val="20"/>
+      </w:rPr>
+    </w:lvl>
+  </w:abstractNum>
+  <w:abstractNum w:abstractNumId="31" w15:restartNumberingAfterBreak="0">
     <w:nsid w:val="67EF0DB8"/>
     <w:multiLevelType w:val="multilevel"/>
     <w:tmpl w:val="093A39B6"/>
@@ -10293,7 +10172,7 @@
       </w:pPr>
     </w:lvl>
   </w:abstractNum>
-  <w:abstractNum w:abstractNumId="29" w15:restartNumberingAfterBreak="0">
+  <w:abstractNum w:abstractNumId="32" w15:restartNumberingAfterBreak="0">
     <w:nsid w:val="689D1B80"/>
     <w:multiLevelType w:val="multilevel"/>
     <w:tmpl w:val="7354C608"/>
@@ -10406,7 +10285,7 @@
       </w:pPr>
     </w:lvl>
   </w:abstractNum>
-  <w:abstractNum w:abstractNumId="30" w15:restartNumberingAfterBreak="0">
+  <w:abstractNum w:abstractNumId="33" w15:restartNumberingAfterBreak="0">
     <w:nsid w:val="6AFF73EE"/>
     <w:multiLevelType w:val="multilevel"/>
     <w:tmpl w:val="9314E93C"/>
@@ -10555,7 +10434,7 @@
       </w:rPr>
     </w:lvl>
   </w:abstractNum>
-  <w:abstractNum w:abstractNumId="31" w15:restartNumberingAfterBreak="0">
+  <w:abstractNum w:abstractNumId="34" w15:restartNumberingAfterBreak="0">
     <w:nsid w:val="6BD04753"/>
     <w:multiLevelType w:val="hybridMultilevel"/>
     <w:tmpl w:val="1F10EDD0"/>
@@ -10641,7 +10520,7 @@
       </w:pPr>
     </w:lvl>
   </w:abstractNum>
-  <w:abstractNum w:abstractNumId="32" w15:restartNumberingAfterBreak="0">
+  <w:abstractNum w:abstractNumId="35" w15:restartNumberingAfterBreak="0">
     <w:nsid w:val="6BFC62F4"/>
     <w:multiLevelType w:val="hybridMultilevel"/>
     <w:tmpl w:val="195EA346"/>
@@ -10732,7 +10611,156 @@
       </w:pPr>
     </w:lvl>
   </w:abstractNum>
-  <w:abstractNum w:abstractNumId="33" w15:restartNumberingAfterBreak="0">
+  <w:abstractNum w:abstractNumId="36" w15:restartNumberingAfterBreak="0">
+    <w:nsid w:val="6C012936"/>
+    <w:multiLevelType w:val="multilevel"/>
+    <w:tmpl w:val="59A6C5A8"/>
+    <w:lvl w:ilvl="0">
+      <w:start w:val="1"/>
+      <w:numFmt w:val="bullet"/>
+      <w:lvlText w:val=""/>
+      <w:lvlJc w:val="left"/>
+      <w:pPr>
+        <w:tabs>
+          <w:tab w:val="num" w:pos="2160"/>
+        </w:tabs>
+        <w:ind w:left="2160" w:hanging="360"/>
+      </w:pPr>
+      <w:rPr>
+        <w:rFonts w:ascii="Symbol" w:hAnsi="Symbol" w:hint="default"/>
+        <w:sz w:val="20"/>
+      </w:rPr>
+    </w:lvl>
+    <w:lvl w:ilvl="1" w:tentative="1">
+      <w:start w:val="1"/>
+      <w:numFmt w:val="bullet"/>
+      <w:lvlText w:val="o"/>
+      <w:lvlJc w:val="left"/>
+      <w:pPr>
+        <w:tabs>
+          <w:tab w:val="num" w:pos="2880"/>
+        </w:tabs>
+        <w:ind w:left="2880" w:hanging="360"/>
+      </w:pPr>
+      <w:rPr>
+        <w:rFonts w:ascii="Courier New" w:hAnsi="Courier New" w:hint="default"/>
+        <w:sz w:val="20"/>
+      </w:rPr>
+    </w:lvl>
+    <w:lvl w:ilvl="2" w:tentative="1">
+      <w:start w:val="1"/>
+      <w:numFmt w:val="bullet"/>
+      <w:lvlText w:val=""/>
+      <w:lvlJc w:val="left"/>
+      <w:pPr>
+        <w:tabs>
+          <w:tab w:val="num" w:pos="3600"/>
+        </w:tabs>
+        <w:ind w:left="3600" w:hanging="360"/>
+      </w:pPr>
+      <w:rPr>
+        <w:rFonts w:ascii="Wingdings" w:hAnsi="Wingdings" w:hint="default"/>
+        <w:sz w:val="20"/>
+      </w:rPr>
+    </w:lvl>
+    <w:lvl w:ilvl="3" w:tentative="1">
+      <w:start w:val="1"/>
+      <w:numFmt w:val="bullet"/>
+      <w:lvlText w:val=""/>
+      <w:lvlJc w:val="left"/>
+      <w:pPr>
+        <w:tabs>
+          <w:tab w:val="num" w:pos="4320"/>
+        </w:tabs>
+        <w:ind w:left="4320" w:hanging="360"/>
+      </w:pPr>
+      <w:rPr>
+        <w:rFonts w:ascii="Wingdings" w:hAnsi="Wingdings" w:hint="default"/>
+        <w:sz w:val="20"/>
+      </w:rPr>
+    </w:lvl>
+    <w:lvl w:ilvl="4" w:tentative="1">
+      <w:start w:val="1"/>
+      <w:numFmt w:val="bullet"/>
+      <w:lvlText w:val=""/>
+      <w:lvlJc w:val="left"/>
+      <w:pPr>
+        <w:tabs>
+          <w:tab w:val="num" w:pos="5040"/>
+        </w:tabs>
+        <w:ind w:left="5040" w:hanging="360"/>
+      </w:pPr>
+      <w:rPr>
+        <w:rFonts w:ascii="Wingdings" w:hAnsi="Wingdings" w:hint="default"/>
+        <w:sz w:val="20"/>
+      </w:rPr>
+    </w:lvl>
+    <w:lvl w:ilvl="5" w:tentative="1">
+      <w:start w:val="1"/>
+      <w:numFmt w:val="bullet"/>
+      <w:lvlText w:val=""/>
+      <w:lvlJc w:val="left"/>
+      <w:pPr>
+        <w:tabs>
+          <w:tab w:val="num" w:pos="5760"/>
+        </w:tabs>
+        <w:ind w:left="5760" w:hanging="360"/>
+      </w:pPr>
+      <w:rPr>
+        <w:rFonts w:ascii="Wingdings" w:hAnsi="Wingdings" w:hint="default"/>
+        <w:sz w:val="20"/>
+      </w:rPr>
+    </w:lvl>
+    <w:lvl w:ilvl="6" w:tentative="1">
+      <w:start w:val="1"/>
+      <w:numFmt w:val="bullet"/>
+      <w:lvlText w:val=""/>
+      <w:lvlJc w:val="left"/>
+      <w:pPr>
+        <w:tabs>
+          <w:tab w:val="num" w:pos="6480"/>
+        </w:tabs>
+        <w:ind w:left="6480" w:hanging="360"/>
+      </w:pPr>
+      <w:rPr>
+        <w:rFonts w:ascii="Wingdings" w:hAnsi="Wingdings" w:hint="default"/>
+        <w:sz w:val="20"/>
+      </w:rPr>
+    </w:lvl>
+    <w:lvl w:ilvl="7" w:tentative="1">
+      <w:start w:val="1"/>
+      <w:numFmt w:val="bullet"/>
+      <w:lvlText w:val=""/>
+      <w:lvlJc w:val="left"/>
+      <w:pPr>
+        <w:tabs>
+          <w:tab w:val="num" w:pos="7200"/>
+        </w:tabs>
+        <w:ind w:left="7200" w:hanging="360"/>
+      </w:pPr>
+      <w:rPr>
+        <w:rFonts w:ascii="Wingdings" w:hAnsi="Wingdings" w:hint="default"/>
+        <w:sz w:val="20"/>
+      </w:rPr>
+    </w:lvl>
+    <w:lvl w:ilvl="8" w:tentative="1">
+      <w:start w:val="1"/>
+      <w:numFmt w:val="bullet"/>
+      <w:lvlText w:val=""/>
+      <w:lvlJc w:val="left"/>
+      <w:pPr>
+        <w:tabs>
+          <w:tab w:val="num" w:pos="7920"/>
+        </w:tabs>
+        <w:ind w:left="7920" w:hanging="360"/>
+      </w:pPr>
+      <w:rPr>
+        <w:rFonts w:ascii="Wingdings" w:hAnsi="Wingdings" w:hint="default"/>
+        <w:sz w:val="20"/>
+      </w:rPr>
+    </w:lvl>
+  </w:abstractNum>
+  <w:abstractNum w:abstractNumId="37" w15:restartNumberingAfterBreak="0">
     <w:nsid w:val="71440C01"/>
     <w:multiLevelType w:val="multilevel"/>
     <w:tmpl w:val="53EE5380"/>
@@ -10845,7 +10873,7 @@
       </w:pPr>
     </w:lvl>
   </w:abstractNum>
-  <w:abstractNum w:abstractNumId="34" w15:restartNumberingAfterBreak="0">
+  <w:abstractNum w:abstractNumId="38" w15:restartNumberingAfterBreak="0">
     <w:nsid w:val="76C959F5"/>
     <w:multiLevelType w:val="multilevel"/>
     <w:tmpl w:val="8E3031F6"/>
@@ -10994,7 +11022,7 @@
       </w:rPr>
     </w:lvl>
   </w:abstractNum>
-  <w:abstractNum w:abstractNumId="35" w15:restartNumberingAfterBreak="0">
+  <w:abstractNum w:abstractNumId="39" w15:restartNumberingAfterBreak="0">
     <w:nsid w:val="78F0586F"/>
     <w:multiLevelType w:val="hybridMultilevel"/>
     <w:tmpl w:val="EBC6C49E"/>
@@ -11107,7 +11135,96 @@
       </w:rPr>
     </w:lvl>
   </w:abstractNum>
-  <w:abstractNum w:abstractNumId="36" w15:restartNumberingAfterBreak="0">
+  <w:abstractNum w:abstractNumId="40" w15:restartNumberingAfterBreak="0">
+    <w:nsid w:val="7CD95B6A"/>
+    <w:multiLevelType w:val="hybridMultilevel"/>
+    <w:tmpl w:val="BFE64F5A"/>
+    <w:lvl w:ilvl="0" w:tplc="0409000F">
+      <w:start w:val="1"/>
+      <w:numFmt w:val="decimal"/>
+      <w:lvlText w:val="%1."/>
+      <w:lvlJc w:val="left"/>
+      <w:pPr>
+        <w:ind w:left="1080" w:hanging="360"/>
+      </w:pPr>
+      <w:rPr>
+        <w:rFonts w:hint="default"/>
+      </w:rPr>
+    </w:lvl>
+    <w:lvl w:ilvl="1" w:tplc="04090019">
+      <w:start w:val="1"/>
+      <w:numFmt w:val="lowerLetter"/>
+      <w:lvlText w:val="%2."/>
+      <w:lvlJc w:val="left"/>
+      <w:pPr>
+        <w:ind w:left="1800" w:hanging="360"/>
+      </w:pPr>
+    </w:lvl>
+    <w:lvl w:ilvl="2" w:tplc="0409001B" w:tentative="1">
+      <w:start w:val="1"/>
+      <w:numFmt w:val="lowerRoman"/>
+      <w:lvlText w:val="%3."/>
+      <w:lvlJc w:val="right"/>
+      <w:pPr>
+        <w:ind w:left="2520" w:hanging="180"/>
+      </w:pPr>
+    </w:lvl>
+    <w:lvl w:ilvl="3" w:tplc="0409000F" w:tentative="1">
+      <w:start w:val="1"/>
+      <w:numFmt w:val="decimal"/>
+      <w:lvlText w:val="%4."/>
+      <w:lvlJc w:val="left"/>
+      <w:pPr>
+        <w:ind w:left="3240" w:hanging="360"/>
+      </w:pPr>
+    </w:lvl>
+    <w:lvl w:ilvl="4" w:tplc="04090019" w:tentative="1">
+      <w:start w:val="1"/>
+      <w:numFmt w:val="lowerLetter"/>
+      <w:lvlText w:val="%5."/>
+      <w:lvlJc w:val="left"/>
+      <w:pPr>
+        <w:ind w:left="3960" w:hanging="360"/>
+      </w:pPr>
+    </w:lvl>
+    <w:lvl w:ilvl="5" w:tplc="0409001B" w:tentative="1">
+      <w:start w:val="1"/>
+      <w:numFmt w:val="lowerRoman"/>
+      <w:lvlText w:val="%6."/>
+      <w:lvlJc w:val="right"/>
+      <w:pPr>
+        <w:ind w:left="4680" w:hanging="180"/>
+      </w:pPr>
+    </w:lvl>
+    <w:lvl w:ilvl="6" w:tplc="0409000F" w:tentative="1">
+      <w:start w:val="1"/>
+      <w:numFmt w:val="decimal"/>
+      <w:lvlText w:val="%7."/>
+      <w:lvlJc w:val="left"/>
+      <w:pPr>
+        <w:ind w:left="5400" w:hanging="360"/>
+      </w:pPr>
+    </w:lvl>
+    <w:lvl w:ilvl="7" w:tplc="04090019" w:tentative="1">
+      <w:start w:val="1"/>
+      <w:numFmt w:val="lowerLetter"/>
+      <w:lvlText w:val="%8."/>
+      <w:lvlJc w:val="left"/>
+      <w:pPr>
+        <w:ind w:left="6120" w:hanging="360"/>
+      </w:pPr>
+    </w:lvl>
+    <w:lvl w:ilvl="8" w:tplc="0409001B" w:tentative="1">
+      <w:start w:val="1"/>
+      <w:numFmt w:val="lowerRoman"/>
+      <w:lvlText w:val="%9."/>
+      <w:lvlJc w:val="right"/>
+      <w:pPr>
+        <w:ind w:left="6840" w:hanging="180"/>
+      </w:pPr>
+    </w:lvl>
+  </w:abstractNum>
+  <w:abstractNum w:abstractNumId="41" w15:restartNumberingAfterBreak="0">
     <w:nsid w:val="7DEA5EF7"/>
     <w:multiLevelType w:val="hybridMultilevel"/>
     <w:tmpl w:val="FEAA7DDA"/>
@@ -11220,7 +11337,156 @@
       </w:rPr>
     </w:lvl>
   </w:abstractNum>
-  <w:abstractNum w:abstractNumId="37" w15:restartNumberingAfterBreak="0">
+  <w:abstractNum w:abstractNumId="42" w15:restartNumberingAfterBreak="0">
+    <w:nsid w:val="7EAD7D37"/>
+    <w:multiLevelType w:val="multilevel"/>
+    <w:tmpl w:val="F13AFE5C"/>
+    <w:lvl w:ilvl="0">
+      <w:start w:val="1"/>
+      <w:numFmt w:val="bullet"/>
+      <w:lvlText w:val=""/>
+      <w:lvlJc w:val="left"/>
+      <w:pPr>
+        <w:tabs>
+          <w:tab w:val="num" w:pos="2160"/>
+        </w:tabs>
+        <w:ind w:left="2160" w:hanging="360"/>
+      </w:pPr>
+      <w:rPr>
+        <w:rFonts w:ascii="Symbol" w:hAnsi="Symbol" w:hint="default"/>
+        <w:sz w:val="20"/>
+      </w:rPr>
+    </w:lvl>
+    <w:lvl w:ilvl="1" w:tentative="1">
+      <w:start w:val="1"/>
+      <w:numFmt w:val="bullet"/>
+      <w:lvlText w:val="o"/>
+      <w:lvlJc w:val="left"/>
+      <w:pPr>
+        <w:tabs>
+          <w:tab w:val="num" w:pos="2880"/>
+        </w:tabs>
+        <w:ind w:left="2880" w:hanging="360"/>
+      </w:pPr>
+      <w:rPr>
+        <w:rFonts w:ascii="Courier New" w:hAnsi="Courier New" w:hint="default"/>
+        <w:sz w:val="20"/>
+      </w:rPr>
+    </w:lvl>
+    <w:lvl w:ilvl="2" w:tentative="1">
+      <w:start w:val="1"/>
+      <w:numFmt w:val="bullet"/>
+      <w:lvlText w:val=""/>
+      <w:lvlJc w:val="left"/>
+      <w:pPr>
+        <w:tabs>
+          <w:tab w:val="num" w:pos="3600"/>
+        </w:tabs>
+        <w:ind w:left="3600" w:hanging="360"/>
+      </w:pPr>
+      <w:rPr>
+        <w:rFonts w:ascii="Wingdings" w:hAnsi="Wingdings" w:hint="default"/>
+        <w:sz w:val="20"/>
+      </w:rPr>
+    </w:lvl>
+    <w:lvl w:ilvl="3" w:tentative="1">
+      <w:start w:val="1"/>
+      <w:numFmt w:val="bullet"/>
+      <w:lvlText w:val=""/>
+      <w:lvlJc w:val="left"/>
+      <w:pPr>
+        <w:tabs>
+          <w:tab w:val="num" w:pos="4320"/>
+        </w:tabs>
+        <w:ind w:left="4320" w:hanging="360"/>
+      </w:pPr>
+      <w:rPr>
+        <w:rFonts w:ascii="Wingdings" w:hAnsi="Wingdings" w:hint="default"/>
+        <w:sz w:val="20"/>
+      </w:rPr>
+    </w:lvl>
+    <w:lvl w:ilvl="4" w:tentative="1">
+      <w:start w:val="1"/>
+      <w:numFmt w:val="bullet"/>
+      <w:lvlText w:val=""/>
+      <w:lvlJc w:val="left"/>
+      <w:pPr>
+        <w:tabs>
+          <w:tab w:val="num" w:pos="5040"/>
+        </w:tabs>
+        <w:ind w:left="5040" w:hanging="360"/>
+      </w:pPr>
+      <w:rPr>
+        <w:rFonts w:ascii="Wingdings" w:hAnsi="Wingdings" w:hint="default"/>
+        <w:sz w:val="20"/>
+      </w:rPr>
+    </w:lvl>
+    <w:lvl w:ilvl="5" w:tentative="1">
+      <w:start w:val="1"/>
+      <w:numFmt w:val="bullet"/>
+      <w:lvlText w:val=""/>
+      <w:lvlJc w:val="left"/>
+      <w:pPr>
+        <w:tabs>
+          <w:tab w:val="num" w:pos="5760"/>
+        </w:tabs>
+        <w:ind w:left="5760" w:hanging="360"/>
+      </w:pPr>
+      <w:rPr>
+        <w:rFonts w:ascii="Wingdings" w:hAnsi="Wingdings" w:hint="default"/>
+        <w:sz w:val="20"/>
+      </w:rPr>
+    </w:lvl>
+    <w:lvl w:ilvl="6" w:tentative="1">
+      <w:start w:val="1"/>
+      <w:numFmt w:val="bullet"/>
+      <w:lvlText w:val=""/>
+      <w:lvlJc w:val="left"/>
+      <w:pPr>
+        <w:tabs>
+          <w:tab w:val="num" w:pos="6480"/>
+        </w:tabs>
+        <w:ind w:left="6480" w:hanging="360"/>
+      </w:pPr>
+      <w:rPr>
+        <w:rFonts w:ascii="Wingdings" w:hAnsi="Wingdings" w:hint="default"/>
+        <w:sz w:val="20"/>
+      </w:rPr>
+    </w:lvl>
+    <w:lvl w:ilvl="7" w:tentative="1">
+      <w:start w:val="1"/>
+      <w:numFmt w:val="bullet"/>
+      <w:lvlText w:val=""/>
+      <w:lvlJc w:val="left"/>
+      <w:pPr>
+        <w:tabs>
+          <w:tab w:val="num" w:pos="7200"/>
+        </w:tabs>
+        <w:ind w:left="7200" w:hanging="360"/>
+      </w:pPr>
+      <w:rPr>
+        <w:rFonts w:ascii="Wingdings" w:hAnsi="Wingdings" w:hint="default"/>
+        <w:sz w:val="20"/>
+      </w:rPr>
+    </w:lvl>
+    <w:lvl w:ilvl="8" w:tentative="1">
+      <w:start w:val="1"/>
+      <w:numFmt w:val="bullet"/>
+      <w:lvlText w:val=""/>
+      <w:lvlJc w:val="left"/>
+      <w:pPr>
+        <w:tabs>
+          <w:tab w:val="num" w:pos="7920"/>
+        </w:tabs>
+        <w:ind w:left="7920" w:hanging="360"/>
+      </w:pPr>
+      <w:rPr>
+        <w:rFonts w:ascii="Wingdings" w:hAnsi="Wingdings" w:hint="default"/>
+        <w:sz w:val="20"/>
+      </w:rPr>
+    </w:lvl>
+  </w:abstractNum>
+  <w:abstractNum w:abstractNumId="43" w15:restartNumberingAfterBreak="0">
     <w:nsid w:val="7F8E40C3"/>
     <w:multiLevelType w:val="hybridMultilevel"/>
     <w:tmpl w:val="6A3CDCAA"/>
@@ -11311,7 +11577,7 @@
       </w:pPr>
     </w:lvl>
   </w:abstractNum>
-  <w:abstractNum w:abstractNumId="38" w15:restartNumberingAfterBreak="0">
+  <w:abstractNum w:abstractNumId="44" w15:restartNumberingAfterBreak="0">
     <w:nsid w:val="7FA5276B"/>
     <w:multiLevelType w:val="multilevel"/>
     <w:tmpl w:val="FDC4E968"/>
@@ -11424,7 +11690,7 @@
       </w:pPr>
     </w:lvl>
   </w:abstractNum>
-  <w:abstractNum w:abstractNumId="39" w15:restartNumberingAfterBreak="0">
+  <w:abstractNum w:abstractNumId="45" w15:restartNumberingAfterBreak="0">
     <w:nsid w:val="7FE542E6"/>
     <w:multiLevelType w:val="hybridMultilevel"/>
     <w:tmpl w:val="60121210"/>
@@ -11537,7 +11803,7 @@
       </w:rPr>
     </w:lvl>
   </w:abstractNum>
-  <w:abstractNum w:abstractNumId="40" w15:restartNumberingAfterBreak="0">
+  <w:abstractNum w:abstractNumId="46" w15:restartNumberingAfterBreak="0">
     <w:nsid w:val="7FE65D70"/>
     <w:multiLevelType w:val="hybridMultilevel"/>
     <w:tmpl w:val="DE88C27C"/>
@@ -11627,10 +11893,10 @@
     </w:lvl>
   </w:abstractNum>
   <w:num w:numId="1" w16cid:durableId="1708216049">
-    <w:abstractNumId w:val="38"/>
+    <w:abstractNumId w:val="44"/>
   </w:num>
   <w:num w:numId="2" w16cid:durableId="1956671598">
-    <w:abstractNumId w:val="31"/>
+    <w:abstractNumId w:val="34"/>
   </w:num>
   <w:num w:numId="3" w16cid:durableId="300772083">
     <w:abstractNumId w:val="8"/>
@@ -11639,7 +11905,7 @@
     <w:abstractNumId w:val="6"/>
   </w:num>
   <w:num w:numId="5" w16cid:durableId="40175433">
-    <w:abstractNumId w:val="37"/>
+    <w:abstractNumId w:val="43"/>
   </w:num>
   <w:num w:numId="6" w16cid:durableId="761343490">
     <w:abstractNumId w:val="13"/>
@@ -11648,7 +11914,7 @@
     <w:abstractNumId w:val="3"/>
   </w:num>
   <w:num w:numId="8" w16cid:durableId="708918462">
-    <w:abstractNumId w:val="32"/>
+    <w:abstractNumId w:val="35"/>
   </w:num>
   <w:num w:numId="9" w16cid:durableId="348214343">
     <w:abstractNumId w:val="1"/>
@@ -11666,31 +11932,31 @@
     <w:abstractNumId w:val="15"/>
   </w:num>
   <w:num w:numId="14" w16cid:durableId="1946378332">
-    <w:abstractNumId w:val="36"/>
+    <w:abstractNumId w:val="41"/>
   </w:num>
   <w:num w:numId="15" w16cid:durableId="852260861">
-    <w:abstractNumId w:val="39"/>
+    <w:abstractNumId w:val="45"/>
   </w:num>
   <w:num w:numId="16" w16cid:durableId="221018161">
     <w:abstractNumId w:val="22"/>
   </w:num>
   <w:num w:numId="17" w16cid:durableId="110394430">
-    <w:abstractNumId w:val="26"/>
+    <w:abstractNumId w:val="27"/>
   </w:num>
   <w:num w:numId="18" w16cid:durableId="1673995805">
-    <w:abstractNumId w:val="33"/>
+    <w:abstractNumId w:val="37"/>
   </w:num>
   <w:num w:numId="19" w16cid:durableId="284502043">
-    <w:abstractNumId w:val="24"/>
+    <w:abstractNumId w:val="25"/>
   </w:num>
   <w:num w:numId="20" w16cid:durableId="1484421383">
     <w:abstractNumId w:val="10"/>
   </w:num>
   <w:num w:numId="21" w16cid:durableId="543296465">
-    <w:abstractNumId w:val="35"/>
+    <w:abstractNumId w:val="39"/>
   </w:num>
   <w:num w:numId="22" w16cid:durableId="1015182441">
-    <w:abstractNumId w:val="28"/>
+    <w:abstractNumId w:val="31"/>
   </w:num>
   <w:num w:numId="23" w16cid:durableId="330178598">
     <w:abstractNumId w:val="18"/>
@@ -11699,13 +11965,13 @@
     <w:abstractNumId w:val="5"/>
   </w:num>
   <w:num w:numId="25" w16cid:durableId="263224602">
-    <w:abstractNumId w:val="34"/>
+    <w:abstractNumId w:val="38"/>
   </w:num>
   <w:num w:numId="26" w16cid:durableId="1805192953">
     <w:abstractNumId w:val="11"/>
   </w:num>
   <w:num w:numId="27" w16cid:durableId="1851527278">
-    <w:abstractNumId w:val="27"/>
+    <w:abstractNumId w:val="29"/>
   </w:num>
   <w:num w:numId="28" w16cid:durableId="2081639112">
     <w:abstractNumId w:val="9"/>
@@ -11714,7 +11980,7 @@
     <w:abstractNumId w:val="0"/>
   </w:num>
   <w:num w:numId="30" w16cid:durableId="739643488">
-    <w:abstractNumId w:val="30"/>
+    <w:abstractNumId w:val="33"/>
   </w:num>
   <w:num w:numId="31" w16cid:durableId="609820130">
     <w:abstractNumId w:val="14"/>
@@ -11723,7 +11989,7 @@
     <w:abstractNumId w:val="23"/>
   </w:num>
   <w:num w:numId="33" w16cid:durableId="1834443072">
-    <w:abstractNumId w:val="29"/>
+    <w:abstractNumId w:val="32"/>
   </w:num>
   <w:num w:numId="34" w16cid:durableId="1167131112">
     <w:abstractNumId w:val="7"/>
@@ -11732,7 +11998,7 @@
     <w:abstractNumId w:val="16"/>
   </w:num>
   <w:num w:numId="36" w16cid:durableId="570653371">
-    <w:abstractNumId w:val="25"/>
+    <w:abstractNumId w:val="26"/>
   </w:num>
   <w:num w:numId="37" w16cid:durableId="1477066861">
     <w:abstractNumId w:val="2"/>
@@ -11747,7 +12013,25 @@
     <w:abstractNumId w:val="12"/>
   </w:num>
   <w:num w:numId="41" w16cid:durableId="1590889591">
+    <w:abstractNumId w:val="46"/>
+  </w:num>
+  <w:num w:numId="42" w16cid:durableId="167329187">
     <w:abstractNumId w:val="40"/>
+  </w:num>
+  <w:num w:numId="43" w16cid:durableId="1058936449">
+    <w:abstractNumId w:val="28"/>
+  </w:num>
+  <w:num w:numId="44" w16cid:durableId="2043437351">
+    <w:abstractNumId w:val="24"/>
+  </w:num>
+  <w:num w:numId="45" w16cid:durableId="603154598">
+    <w:abstractNumId w:val="36"/>
+  </w:num>
+  <w:num w:numId="46" w16cid:durableId="1659114142">
+    <w:abstractNumId w:val="42"/>
+  </w:num>
+  <w:num w:numId="47" w16cid:durableId="1184780217">
+    <w:abstractNumId w:val="30"/>
   </w:num>
 </w:numbering>
 </file>

</xml_diff>